<commit_message>
Add Figma wireframe and link
</commit_message>
<xml_diff>
--- a/PROG209_Sahr_Swing_Assignment.docx
+++ b/PROG209_Sahr_Swing_Assignment.docx
@@ -1318,7 +1318,7 @@
       <w:r>
         <w:drawing>
           <wp:inline distT="0" distB="0" distL="0" distR="0">
-            <wp:extent cx="3429000" cy="3562350"/>
+            <wp:extent cx="3429000" cy="3429000"/>
             <wp:effectExtent t="0" r="0" b="0" l="0"/>
             <wp:docPr id="1" name="wireframe-reference.png" descr="Figure 1: Wireframe of the application layout" title="Figure 1: Wireframe of the application layout"/>
             <wp:cNvGraphicFramePr>
@@ -1343,7 +1343,7 @@
                   <pic:spPr bwMode="auto">
                     <a:xfrm>
                       <a:off x="0" y="0"/>
-                      <a:ext cx="3429000" cy="3562350"/>
+                      <a:ext cx="3429000" cy="3429000"/>
                     </a:xfrm>
                     <a:prstGeom prst="rect">
                       <a:avLst/>
@@ -1370,6 +1370,20 @@
           <w:szCs w:val="24"/>
         </w:rPr>
         <w:t xml:space="preserve">Figure 1: Wireframe of the application layout</w:t>
+      </w:r>
+    </w:p>
+    <w:p>
+      <w:pPr>
+        <w:spacing w:after="120" w:line="276" w:lineRule="auto"/>
+        <w:jc w:val="both"/>
+      </w:pPr>
+      <w:r>
+        <w:rPr>
+          <w:rFonts w:ascii="Tahoma" w:hAnsi="Tahoma" w:cs="Tahoma" w:eastAsia="Tahoma"/>
+          <w:sz w:val="24"/>
+          <w:szCs w:val="24"/>
+        </w:rPr>
+        <w:t xml:space="preserve">Figma link: https://www.figma.com/design/35cVrKGiYNXCoDbFic19er</w:t>
       </w:r>
     </w:p>
     <w:p>

</xml_diff>

<commit_message>
Redesign GUI with modern theme, new logo and colour options
</commit_message>
<xml_diff>
--- a/PROG209_Sahr_Swing_Assignment.docx
+++ b/PROG209_Sahr_Swing_Assignment.docx
@@ -11,9 +11,9 @@
       <w:r>
         <w:drawing>
           <wp:inline distT="0" distB="0" distL="0" distR="0">
-            <wp:extent cx="857250" cy="857250"/>
+            <wp:extent cx="1047750" cy="1047750"/>
             <wp:effectExtent t="0" r="0" b="0" l="0"/>
-            <wp:docPr id="1" name="icon.png"/>
+            <wp:docPr id="1" name="logo.png" descr="" title=""/>
             <wp:cNvGraphicFramePr>
               <a:graphicFrameLocks xmlns:a="http://schemas.openxmlformats.org/drawingml/2006/main" noChangeAspect="1"/>
             </wp:cNvGraphicFramePr>
@@ -36,7 +36,7 @@
                   <pic:spPr bwMode="auto">
                     <a:xfrm>
                       <a:off x="0" y="0"/>
-                      <a:ext cx="857250" cy="857250"/>
+                      <a:ext cx="1047750" cy="1047750"/>
                     </a:xfrm>
                     <a:prstGeom prst="rect">
                       <a:avLst/>
@@ -51,7 +51,7 @@
     </w:p>
     <w:p>
       <w:pPr>
-        <w:spacing w:after="60"/>
+        <w:spacing w:after="60" w:before="200"/>
         <w:jc w:val="center"/>
       </w:pPr>
       <w:r>
@@ -59,16 +59,62 @@
           <w:rFonts w:ascii="Tahoma" w:cs="Tahoma" w:eastAsia="Tahoma" w:hAnsi="Tahoma"/>
           <w:b/>
           <w:bCs/>
-          <w:color w:val="1A52A0"/>
+          <w:color w:val="3B3FB5"/>
+          <w:sz w:val="28"/>
+          <w:szCs w:val="28"/>
+        </w:rPr>
+        <w:t xml:space="preserve">LIMKOKWING UNIVERSITY OF CREATIVE TECHNOLOGY</w:t>
+      </w:r>
+    </w:p>
+    <w:p>
+      <w:pPr>
+        <w:spacing w:after="700"/>
+        <w:jc w:val="center"/>
+      </w:pPr>
+      <w:r>
+        <w:rPr>
+          <w:rFonts w:ascii="Tahoma" w:cs="Tahoma" w:eastAsia="Tahoma" w:hAnsi="Tahoma"/>
+          <w:b/>
+          <w:bCs/>
+          <w:sz w:val="24"/>
+          <w:szCs w:val="24"/>
+        </w:rPr>
+        <w:t xml:space="preserve">SIERRA LEONE</w:t>
+      </w:r>
+    </w:p>
+    <w:p>
+      <w:pPr>
+        <w:spacing w:after="140"/>
+        <w:jc w:val="center"/>
+      </w:pPr>
+      <w:r>
+        <w:rPr>
+          <w:rFonts w:ascii="Tahoma" w:cs="Tahoma" w:eastAsia="Tahoma" w:hAnsi="Tahoma"/>
+          <w:b/>
+          <w:bCs/>
+          <w:sz w:val="34"/>
+          <w:szCs w:val="34"/>
+        </w:rPr>
+        <w:t xml:space="preserve">PROG209 – EVENT DRIVEN PROGRAMMING</w:t>
+      </w:r>
+    </w:p>
+    <w:p>
+      <w:pPr>
+        <w:spacing w:after="140"/>
+        <w:jc w:val="center"/>
+      </w:pPr>
+      <w:r>
+        <w:rPr>
+          <w:rFonts w:ascii="Tahoma" w:cs="Tahoma" w:eastAsia="Tahoma" w:hAnsi="Tahoma"/>
           <w:sz w:val="26"/>
           <w:szCs w:val="26"/>
         </w:rPr>
-        <w:t xml:space="preserve">LIMKOKWING UNIVERSITY OF CREATIVE TECHNOLOGY</w:t>
-      </w:r>
-    </w:p>
-    <w:p>
-      <w:pPr>
-        <w:spacing w:after="60"/>
+        <w:t xml:space="preserve">Individual Assignment (10%)</w:t>
+      </w:r>
+    </w:p>
+    <w:p>
+      <w:pPr>
+        <w:spacing w:after="800"/>
         <w:jc w:val="center"/>
       </w:pPr>
       <w:r>
@@ -76,69 +122,9 @@
           <w:rFonts w:ascii="Tahoma" w:cs="Tahoma" w:eastAsia="Tahoma" w:hAnsi="Tahoma"/>
           <w:b/>
           <w:bCs/>
-          <w:sz w:val="22"/>
-          <w:szCs w:val="22"/>
-        </w:rPr>
-        <w:t xml:space="preserve">SIERRA LEONE</w:t>
-      </w:r>
-    </w:p>
-    <w:p>
-      <w:pPr>
-        <w:spacing w:after="600"/>
-        <w:jc w:val="center"/>
-      </w:pPr>
-      <w:r>
-        <w:rPr>
-          <w:rFonts w:ascii="Tahoma" w:cs="Tahoma" w:eastAsia="Tahoma" w:hAnsi="Tahoma"/>
-          <w:sz w:val="22"/>
-          <w:szCs w:val="22"/>
-        </w:rPr>
-        <w:t xml:space="preserve">Department of Information &amp; Communications Technology</w:t>
-      </w:r>
-    </w:p>
-    <w:p>
-      <w:pPr>
-        <w:spacing w:after="120"/>
-        <w:jc w:val="center"/>
-      </w:pPr>
-      <w:r>
-        <w:rPr>
-          <w:rFonts w:ascii="Tahoma" w:cs="Tahoma" w:eastAsia="Tahoma" w:hAnsi="Tahoma"/>
-          <w:b/>
-          <w:bCs/>
-          <w:sz w:val="32"/>
-          <w:szCs w:val="32"/>
-        </w:rPr>
-        <w:t xml:space="preserve">PROG209 – EVENT DRIVEN PROGRAMMING</w:t>
-      </w:r>
-    </w:p>
-    <w:p>
-      <w:pPr>
-        <w:spacing w:after="120"/>
-        <w:jc w:val="center"/>
-      </w:pPr>
-      <w:r>
-        <w:rPr>
-          <w:rFonts w:ascii="Tahoma" w:cs="Tahoma" w:eastAsia="Tahoma" w:hAnsi="Tahoma"/>
-          <w:sz w:val="24"/>
-          <w:szCs w:val="24"/>
-        </w:rPr>
-        <w:t xml:space="preserve">Individual Assignment (10%)</w:t>
-      </w:r>
-    </w:p>
-    <w:p>
-      <w:pPr>
-        <w:spacing w:after="700"/>
-        <w:jc w:val="center"/>
-      </w:pPr>
-      <w:r>
-        <w:rPr>
-          <w:rFonts w:ascii="Tahoma" w:cs="Tahoma" w:eastAsia="Tahoma" w:hAnsi="Tahoma"/>
-          <w:b/>
-          <w:bCs/>
-          <w:color w:val="1A52A0"/>
-          <w:sz w:val="28"/>
-          <w:szCs w:val="28"/>
+          <w:color w:val="3B3FB5"/>
+          <w:sz w:val="30"/>
+          <w:szCs w:val="30"/>
         </w:rPr>
         <w:t xml:space="preserve">Basic Interactive GUI using Java Swing</w:t>
       </w:r>
@@ -162,7 +148,6 @@
       <w:tr>
         <w:trPr>
           <w:cantSplit/>
-          <w:tblHeader w:val="false"/>
         </w:trPr>
         <w:tc>
           <w:tcPr>
@@ -174,23 +159,22 @@
               <w:right w:val="single" w:color="999999" w:sz="4"/>
             </w:tcBorders>
             <w:tcMar>
-              <w:top w:type="dxa" w:w="60"/>
-              <w:left w:type="dxa" w:w="100"/>
-              <w:bottom w:type="dxa" w:w="60"/>
-              <w:right w:type="dxa" w:w="100"/>
+              <w:top w:type="dxa" w:w="70"/>
+              <w:left w:type="dxa" w:w="110"/>
+              <w:bottom w:type="dxa" w:w="70"/>
+              <w:right w:type="dxa" w:w="110"/>
             </w:tcMar>
             <w:vAlign w:val="center"/>
           </w:tcPr>
           <w:p>
             <w:pPr>
-              <w:keepNext/>
               <w:spacing w:line="276"/>
             </w:pPr>
             <w:r>
               <w:rPr>
                 <w:rFonts w:ascii="Tahoma" w:cs="Tahoma" w:eastAsia="Tahoma" w:hAnsi="Tahoma"/>
-                <w:b w:val="false"/>
-                <w:bCs w:val="false"/>
+                <w:b/>
+                <w:bCs/>
                 <w:sz w:val="24"/>
                 <w:szCs w:val="24"/>
               </w:rPr>
@@ -208,35 +192,26 @@
               <w:right w:val="single" w:color="999999" w:sz="4"/>
             </w:tcBorders>
             <w:tcMar>
-              <w:top w:type="dxa" w:w="60"/>
-              <w:left w:type="dxa" w:w="100"/>
-              <w:bottom w:type="dxa" w:w="60"/>
-              <w:right w:type="dxa" w:w="100"/>
+              <w:top w:type="dxa" w:w="70"/>
+              <w:left w:type="dxa" w:w="110"/>
+              <w:bottom w:type="dxa" w:w="70"/>
+              <w:right w:type="dxa" w:w="110"/>
             </w:tcMar>
             <w:vAlign w:val="center"/>
           </w:tcPr>
           <w:p>
             <w:pPr>
-              <w:keepNext/>
               <w:spacing w:line="276"/>
             </w:pPr>
             <w:r>
               <w:rPr>
                 <w:rFonts w:ascii="Tahoma" w:cs="Tahoma" w:eastAsia="Tahoma" w:hAnsi="Tahoma"/>
+                <w:b w:val="false"/>
+                <w:bCs w:val="false"/>
                 <w:sz w:val="24"/>
                 <w:szCs w:val="24"/>
               </w:rPr>
-              <w:t xml:space="preserve">Sahr </w:t>
-            </w:r>
-            <w:r>
-              <w:rPr>
-                <w:rFonts w:ascii="Tahoma" w:cs="Tahoma" w:eastAsia="Tahoma" w:hAnsi="Tahoma"/>
-                <w:sz w:val="24"/>
-                <w:szCs w:val="24"/>
-                <w:highlight w:val="yellow"/>
-                <w:highlightCs w:val="yellow"/>
-              </w:rPr>
-              <w:t xml:space="preserve">[add your full name]</w:t>
+              <w:t xml:space="preserve">Sahr Kemoh Ngaujah</w:t>
             </w:r>
           </w:p>
         </w:tc>
@@ -244,7 +219,6 @@
       <w:tr>
         <w:trPr>
           <w:cantSplit/>
-          <w:tblHeader w:val="false"/>
         </w:trPr>
         <w:tc>
           <w:tcPr>
@@ -256,23 +230,22 @@
               <w:right w:val="single" w:color="999999" w:sz="4"/>
             </w:tcBorders>
             <w:tcMar>
-              <w:top w:type="dxa" w:w="60"/>
-              <w:left w:type="dxa" w:w="100"/>
-              <w:bottom w:type="dxa" w:w="60"/>
-              <w:right w:type="dxa" w:w="100"/>
+              <w:top w:type="dxa" w:w="70"/>
+              <w:left w:type="dxa" w:w="110"/>
+              <w:bottom w:type="dxa" w:w="70"/>
+              <w:right w:type="dxa" w:w="110"/>
             </w:tcMar>
             <w:vAlign w:val="center"/>
           </w:tcPr>
           <w:p>
             <w:pPr>
-              <w:keepNext/>
               <w:spacing w:line="276"/>
             </w:pPr>
             <w:r>
               <w:rPr>
                 <w:rFonts w:ascii="Tahoma" w:cs="Tahoma" w:eastAsia="Tahoma" w:hAnsi="Tahoma"/>
-                <w:b w:val="false"/>
-                <w:bCs w:val="false"/>
+                <w:b/>
+                <w:bCs/>
                 <w:sz w:val="24"/>
                 <w:szCs w:val="24"/>
               </w:rPr>
@@ -290,27 +263,26 @@
               <w:right w:val="single" w:color="999999" w:sz="4"/>
             </w:tcBorders>
             <w:tcMar>
-              <w:top w:type="dxa" w:w="60"/>
-              <w:left w:type="dxa" w:w="100"/>
-              <w:bottom w:type="dxa" w:w="60"/>
-              <w:right w:type="dxa" w:w="100"/>
+              <w:top w:type="dxa" w:w="70"/>
+              <w:left w:type="dxa" w:w="110"/>
+              <w:bottom w:type="dxa" w:w="70"/>
+              <w:right w:type="dxa" w:w="110"/>
             </w:tcMar>
             <w:vAlign w:val="center"/>
           </w:tcPr>
           <w:p>
             <w:pPr>
-              <w:keepNext/>
               <w:spacing w:line="276"/>
             </w:pPr>
             <w:r>
               <w:rPr>
                 <w:rFonts w:ascii="Tahoma" w:cs="Tahoma" w:eastAsia="Tahoma" w:hAnsi="Tahoma"/>
+                <w:b w:val="false"/>
+                <w:bCs w:val="false"/>
                 <w:sz w:val="24"/>
                 <w:szCs w:val="24"/>
-                <w:highlight w:val="yellow"/>
-                <w:highlightCs w:val="yellow"/>
               </w:rPr>
-              <w:t xml:space="preserve">[add your student ID]</w:t>
+              <w:t xml:space="preserve">905005346</w:t>
             </w:r>
           </w:p>
         </w:tc>
@@ -318,7 +290,6 @@
       <w:tr>
         <w:trPr>
           <w:cantSplit/>
-          <w:tblHeader w:val="false"/>
         </w:trPr>
         <w:tc>
           <w:tcPr>
@@ -330,23 +301,22 @@
               <w:right w:val="single" w:color="999999" w:sz="4"/>
             </w:tcBorders>
             <w:tcMar>
-              <w:top w:type="dxa" w:w="60"/>
-              <w:left w:type="dxa" w:w="100"/>
-              <w:bottom w:type="dxa" w:w="60"/>
-              <w:right w:type="dxa" w:w="100"/>
+              <w:top w:type="dxa" w:w="70"/>
+              <w:left w:type="dxa" w:w="110"/>
+              <w:bottom w:type="dxa" w:w="70"/>
+              <w:right w:type="dxa" w:w="110"/>
             </w:tcMar>
             <w:vAlign w:val="center"/>
           </w:tcPr>
           <w:p>
             <w:pPr>
-              <w:keepNext/>
               <w:spacing w:line="276"/>
             </w:pPr>
             <w:r>
               <w:rPr>
                 <w:rFonts w:ascii="Tahoma" w:cs="Tahoma" w:eastAsia="Tahoma" w:hAnsi="Tahoma"/>
-                <w:b w:val="false"/>
-                <w:bCs w:val="false"/>
+                <w:b/>
+                <w:bCs/>
                 <w:sz w:val="24"/>
                 <w:szCs w:val="24"/>
               </w:rPr>
@@ -364,27 +334,26 @@
               <w:right w:val="single" w:color="999999" w:sz="4"/>
             </w:tcBorders>
             <w:tcMar>
-              <w:top w:type="dxa" w:w="60"/>
-              <w:left w:type="dxa" w:w="100"/>
-              <w:bottom w:type="dxa" w:w="60"/>
-              <w:right w:type="dxa" w:w="100"/>
+              <w:top w:type="dxa" w:w="70"/>
+              <w:left w:type="dxa" w:w="110"/>
+              <w:bottom w:type="dxa" w:w="70"/>
+              <w:right w:type="dxa" w:w="110"/>
             </w:tcMar>
             <w:vAlign w:val="center"/>
           </w:tcPr>
           <w:p>
             <w:pPr>
-              <w:keepNext/>
               <w:spacing w:line="276"/>
             </w:pPr>
             <w:r>
               <w:rPr>
                 <w:rFonts w:ascii="Tahoma" w:cs="Tahoma" w:eastAsia="Tahoma" w:hAnsi="Tahoma"/>
+                <w:b w:val="false"/>
+                <w:bCs w:val="false"/>
                 <w:sz w:val="24"/>
                 <w:szCs w:val="24"/>
-                <w:highlight w:val="yellow"/>
-                <w:highlightCs w:val="yellow"/>
               </w:rPr>
-              <w:t xml:space="preserve">[add your programme, e.g. BSc Software Engineering]</w:t>
+              <w:t xml:space="preserve">BIT</w:t>
             </w:r>
           </w:p>
         </w:tc>
@@ -392,7 +361,6 @@
       <w:tr>
         <w:trPr>
           <w:cantSplit/>
-          <w:tblHeader w:val="false"/>
         </w:trPr>
         <w:tc>
           <w:tcPr>
@@ -404,23 +372,22 @@
               <w:right w:val="single" w:color="999999" w:sz="4"/>
             </w:tcBorders>
             <w:tcMar>
-              <w:top w:type="dxa" w:w="60"/>
-              <w:left w:type="dxa" w:w="100"/>
-              <w:bottom w:type="dxa" w:w="60"/>
-              <w:right w:type="dxa" w:w="100"/>
+              <w:top w:type="dxa" w:w="70"/>
+              <w:left w:type="dxa" w:w="110"/>
+              <w:bottom w:type="dxa" w:w="70"/>
+              <w:right w:type="dxa" w:w="110"/>
             </w:tcMar>
             <w:vAlign w:val="center"/>
           </w:tcPr>
           <w:p>
             <w:pPr>
-              <w:keepNext/>
               <w:spacing w:line="276"/>
             </w:pPr>
             <w:r>
               <w:rPr>
                 <w:rFonts w:ascii="Tahoma" w:cs="Tahoma" w:eastAsia="Tahoma" w:hAnsi="Tahoma"/>
-                <w:b w:val="false"/>
-                <w:bCs w:val="false"/>
+                <w:b/>
+                <w:bCs/>
                 <w:sz w:val="24"/>
                 <w:szCs w:val="24"/>
               </w:rPr>
@@ -438,16 +405,15 @@
               <w:right w:val="single" w:color="999999" w:sz="4"/>
             </w:tcBorders>
             <w:tcMar>
-              <w:top w:type="dxa" w:w="60"/>
-              <w:left w:type="dxa" w:w="100"/>
-              <w:bottom w:type="dxa" w:w="60"/>
-              <w:right w:type="dxa" w:w="100"/>
+              <w:top w:type="dxa" w:w="70"/>
+              <w:left w:type="dxa" w:w="110"/>
+              <w:bottom w:type="dxa" w:w="70"/>
+              <w:right w:type="dxa" w:w="110"/>
             </w:tcMar>
             <w:vAlign w:val="center"/>
           </w:tcPr>
           <w:p>
             <w:pPr>
-              <w:keepNext/>
               <w:spacing w:line="276"/>
             </w:pPr>
             <w:r>
@@ -466,7 +432,6 @@
       <w:tr>
         <w:trPr>
           <w:cantSplit/>
-          <w:tblHeader w:val="false"/>
         </w:trPr>
         <w:tc>
           <w:tcPr>
@@ -478,23 +443,22 @@
               <w:right w:val="single" w:color="999999" w:sz="4"/>
             </w:tcBorders>
             <w:tcMar>
-              <w:top w:type="dxa" w:w="60"/>
-              <w:left w:type="dxa" w:w="100"/>
-              <w:bottom w:type="dxa" w:w="60"/>
-              <w:right w:type="dxa" w:w="100"/>
+              <w:top w:type="dxa" w:w="70"/>
+              <w:left w:type="dxa" w:w="110"/>
+              <w:bottom w:type="dxa" w:w="70"/>
+              <w:right w:type="dxa" w:w="110"/>
             </w:tcMar>
             <w:vAlign w:val="center"/>
           </w:tcPr>
           <w:p>
             <w:pPr>
-              <w:keepNext/>
               <w:spacing w:line="276"/>
             </w:pPr>
             <w:r>
               <w:rPr>
                 <w:rFonts w:ascii="Tahoma" w:cs="Tahoma" w:eastAsia="Tahoma" w:hAnsi="Tahoma"/>
-                <w:b w:val="false"/>
-                <w:bCs w:val="false"/>
+                <w:b/>
+                <w:bCs/>
                 <w:sz w:val="24"/>
                 <w:szCs w:val="24"/>
               </w:rPr>
@@ -512,16 +476,15 @@
               <w:right w:val="single" w:color="999999" w:sz="4"/>
             </w:tcBorders>
             <w:tcMar>
-              <w:top w:type="dxa" w:w="60"/>
-              <w:left w:type="dxa" w:w="100"/>
-              <w:bottom w:type="dxa" w:w="60"/>
-              <w:right w:type="dxa" w:w="100"/>
+              <w:top w:type="dxa" w:w="70"/>
+              <w:left w:type="dxa" w:w="110"/>
+              <w:bottom w:type="dxa" w:w="70"/>
+              <w:right w:type="dxa" w:w="110"/>
             </w:tcMar>
             <w:vAlign w:val="center"/>
           </w:tcPr>
           <w:p>
             <w:pPr>
-              <w:keepNext/>
               <w:spacing w:line="276"/>
             </w:pPr>
             <w:r>
@@ -540,7 +503,6 @@
       <w:tr>
         <w:trPr>
           <w:cantSplit/>
-          <w:tblHeader w:val="false"/>
         </w:trPr>
         <w:tc>
           <w:tcPr>
@@ -552,23 +514,22 @@
               <w:right w:val="single" w:color="999999" w:sz="4"/>
             </w:tcBorders>
             <w:tcMar>
-              <w:top w:type="dxa" w:w="60"/>
-              <w:left w:type="dxa" w:w="100"/>
-              <w:bottom w:type="dxa" w:w="60"/>
-              <w:right w:type="dxa" w:w="100"/>
+              <w:top w:type="dxa" w:w="70"/>
+              <w:left w:type="dxa" w:w="110"/>
+              <w:bottom w:type="dxa" w:w="70"/>
+              <w:right w:type="dxa" w:w="110"/>
             </w:tcMar>
             <w:vAlign w:val="center"/>
           </w:tcPr>
           <w:p>
             <w:pPr>
-              <w:keepNext/>
               <w:spacing w:line="276"/>
             </w:pPr>
             <w:r>
               <w:rPr>
                 <w:rFonts w:ascii="Tahoma" w:cs="Tahoma" w:eastAsia="Tahoma" w:hAnsi="Tahoma"/>
-                <w:b w:val="false"/>
-                <w:bCs w:val="false"/>
+                <w:b/>
+                <w:bCs/>
                 <w:sz w:val="24"/>
                 <w:szCs w:val="24"/>
               </w:rPr>
@@ -586,16 +547,15 @@
               <w:right w:val="single" w:color="999999" w:sz="4"/>
             </w:tcBorders>
             <w:tcMar>
-              <w:top w:type="dxa" w:w="60"/>
-              <w:left w:type="dxa" w:w="100"/>
-              <w:bottom w:type="dxa" w:w="60"/>
-              <w:right w:type="dxa" w:w="100"/>
+              <w:top w:type="dxa" w:w="70"/>
+              <w:left w:type="dxa" w:w="110"/>
+              <w:bottom w:type="dxa" w:w="70"/>
+              <w:right w:type="dxa" w:w="110"/>
             </w:tcMar>
             <w:vAlign w:val="center"/>
           </w:tcPr>
           <w:p>
             <w:pPr>
-              <w:keepNext/>
               <w:spacing w:line="276"/>
             </w:pPr>
             <w:r>
@@ -606,7 +566,7 @@
                 <w:sz w:val="24"/>
                 <w:szCs w:val="24"/>
               </w:rPr>
-              <w:t xml:space="preserve">September 2026 to February 2027</w:t>
+              <w:t xml:space="preserve">September 2026 – February 2027</w:t>
             </w:r>
           </w:p>
         </w:tc>
@@ -614,7 +574,6 @@
       <w:tr>
         <w:trPr>
           <w:cantSplit/>
-          <w:tblHeader w:val="false"/>
         </w:trPr>
         <w:tc>
           <w:tcPr>
@@ -626,97 +585,22 @@
               <w:right w:val="single" w:color="999999" w:sz="4"/>
             </w:tcBorders>
             <w:tcMar>
-              <w:top w:type="dxa" w:w="60"/>
-              <w:left w:type="dxa" w:w="100"/>
-              <w:bottom w:type="dxa" w:w="60"/>
-              <w:right w:type="dxa" w:w="100"/>
+              <w:top w:type="dxa" w:w="70"/>
+              <w:left w:type="dxa" w:w="110"/>
+              <w:bottom w:type="dxa" w:w="70"/>
+              <w:right w:type="dxa" w:w="110"/>
             </w:tcMar>
             <w:vAlign w:val="center"/>
           </w:tcPr>
           <w:p>
             <w:pPr>
-              <w:keepNext/>
               <w:spacing w:line="276"/>
             </w:pPr>
             <w:r>
               <w:rPr>
                 <w:rFonts w:ascii="Tahoma" w:cs="Tahoma" w:eastAsia="Tahoma" w:hAnsi="Tahoma"/>
-                <w:b w:val="false"/>
-                <w:bCs w:val="false"/>
-                <w:sz w:val="24"/>
-                <w:szCs w:val="24"/>
-              </w:rPr>
-              <w:t xml:space="preserve">Submission</w:t>
-            </w:r>
-          </w:p>
-        </w:tc>
-        <w:tc>
-          <w:tcPr>
-            <w:tcW w:type="dxa" w:w="6026"/>
-            <w:tcBorders>
-              <w:top w:val="single" w:color="999999" w:sz="4"/>
-              <w:left w:val="single" w:color="999999" w:sz="4"/>
-              <w:bottom w:val="single" w:color="999999" w:sz="4"/>
-              <w:right w:val="single" w:color="999999" w:sz="4"/>
-            </w:tcBorders>
-            <w:tcMar>
-              <w:top w:type="dxa" w:w="60"/>
-              <w:left w:type="dxa" w:w="100"/>
-              <w:bottom w:type="dxa" w:w="60"/>
-              <w:right w:type="dxa" w:w="100"/>
-            </w:tcMar>
-            <w:vAlign w:val="center"/>
-          </w:tcPr>
-          <w:p>
-            <w:pPr>
-              <w:keepNext/>
-              <w:spacing w:line="276"/>
-            </w:pPr>
-            <w:r>
-              <w:rPr>
-                <w:rFonts w:ascii="Tahoma" w:cs="Tahoma" w:eastAsia="Tahoma" w:hAnsi="Tahoma"/>
-                <w:b w:val="false"/>
-                <w:bCs w:val="false"/>
-                <w:sz w:val="24"/>
-                <w:szCs w:val="24"/>
-              </w:rPr>
-              <w:t xml:space="preserve">Week 4</w:t>
-            </w:r>
-          </w:p>
-        </w:tc>
-      </w:tr>
-      <w:tr>
-        <w:trPr>
-          <w:cantSplit/>
-          <w:tblHeader w:val="false"/>
-        </w:trPr>
-        <w:tc>
-          <w:tcPr>
-            <w:tcW w:type="dxa" w:w="3000"/>
-            <w:tcBorders>
-              <w:top w:val="single" w:color="999999" w:sz="4"/>
-              <w:left w:val="single" w:color="999999" w:sz="4"/>
-              <w:bottom w:val="single" w:color="999999" w:sz="4"/>
-              <w:right w:val="single" w:color="999999" w:sz="4"/>
-            </w:tcBorders>
-            <w:tcMar>
-              <w:top w:type="dxa" w:w="60"/>
-              <w:left w:type="dxa" w:w="100"/>
-              <w:bottom w:type="dxa" w:w="60"/>
-              <w:right w:type="dxa" w:w="100"/>
-            </w:tcMar>
-            <w:vAlign w:val="center"/>
-          </w:tcPr>
-          <w:p>
-            <w:pPr>
-              <w:keepNext w:val="false"/>
-              <w:spacing w:line="276"/>
-            </w:pPr>
-            <w:r>
-              <w:rPr>
-                <w:rFonts w:ascii="Tahoma" w:cs="Tahoma" w:eastAsia="Tahoma" w:hAnsi="Tahoma"/>
-                <w:b w:val="false"/>
-                <w:bCs w:val="false"/>
+                <w:b/>
+                <w:bCs/>
                 <w:sz w:val="24"/>
                 <w:szCs w:val="24"/>
               </w:rPr>
@@ -734,27 +618,26 @@
               <w:right w:val="single" w:color="999999" w:sz="4"/>
             </w:tcBorders>
             <w:tcMar>
-              <w:top w:type="dxa" w:w="60"/>
-              <w:left w:type="dxa" w:w="100"/>
-              <w:bottom w:type="dxa" w:w="60"/>
-              <w:right w:type="dxa" w:w="100"/>
+              <w:top w:type="dxa" w:w="70"/>
+              <w:left w:type="dxa" w:w="110"/>
+              <w:bottom w:type="dxa" w:w="70"/>
+              <w:right w:type="dxa" w:w="110"/>
             </w:tcMar>
             <w:vAlign w:val="center"/>
           </w:tcPr>
           <w:p>
             <w:pPr>
-              <w:keepNext w:val="false"/>
               <w:spacing w:line="276"/>
             </w:pPr>
             <w:r>
               <w:rPr>
                 <w:rFonts w:ascii="Tahoma" w:cs="Tahoma" w:eastAsia="Tahoma" w:hAnsi="Tahoma"/>
+                <w:b w:val="false"/>
+                <w:bCs w:val="false"/>
                 <w:sz w:val="24"/>
                 <w:szCs w:val="24"/>
-                <w:highlight w:val="yellow"/>
-                <w:highlightCs w:val="yellow"/>
               </w:rPr>
-              <w:t xml:space="preserve">[paste your GitHub repository link]</w:t>
+              <w:t xml:space="preserve">https://github.com/bakarrabu/sahr-_kemoh-_id_905005346_bit_2101</w:t>
             </w:r>
           </w:p>
         </w:tc>
@@ -775,9 +658,9 @@
           <w:rFonts w:ascii="Tahoma" w:cs="Tahoma" w:eastAsia="Tahoma" w:hAnsi="Tahoma"/>
           <w:b/>
           <w:bCs/>
-          <w:color w:val="1A52A0"/>
-          <w:sz w:val="28"/>
-          <w:szCs w:val="28"/>
+          <w:color w:val="3B3FB5"/>
+          <w:sz w:val="30"/>
+          <w:szCs w:val="30"/>
         </w:rPr>
         <w:t xml:space="preserve">TABLE OF CONTENTS</w:t>
       </w:r>
@@ -787,7 +670,7 @@
         <w:tabs>
           <w:tab w:val="right" w:pos="9026" w:leader="dot"/>
         </w:tabs>
-        <w:spacing w:after="80" w:line="276"/>
+        <w:spacing w:after="90" w:line="276"/>
         <w:ind w:left="0"/>
       </w:pPr>
       <w:r>
@@ -816,7 +699,7 @@
         <w:tabs>
           <w:tab w:val="right" w:pos="9026" w:leader="dot"/>
         </w:tabs>
-        <w:spacing w:after="80" w:line="276"/>
+        <w:spacing w:after="90" w:line="276"/>
         <w:ind w:left="0"/>
       </w:pPr>
       <w:r>
@@ -845,7 +728,7 @@
         <w:tabs>
           <w:tab w:val="right" w:pos="9026" w:leader="dot"/>
         </w:tabs>
-        <w:spacing w:after="80" w:line="276"/>
+        <w:spacing w:after="90" w:line="276"/>
         <w:ind w:left="0"/>
       </w:pPr>
       <w:r>
@@ -874,7 +757,7 @@
         <w:tabs>
           <w:tab w:val="right" w:pos="9026" w:leader="dot"/>
         </w:tabs>
-        <w:spacing w:after="80" w:line="276"/>
+        <w:spacing w:after="90" w:line="276"/>
         <w:ind w:left="0"/>
       </w:pPr>
       <w:r>
@@ -903,7 +786,7 @@
         <w:tabs>
           <w:tab w:val="right" w:pos="9026" w:leader="dot"/>
         </w:tabs>
-        <w:spacing w:after="80" w:line="276"/>
+        <w:spacing w:after="90" w:line="276"/>
         <w:ind w:left="400"/>
       </w:pPr>
       <w:r>
@@ -932,7 +815,7 @@
         <w:tabs>
           <w:tab w:val="right" w:pos="9026" w:leader="dot"/>
         </w:tabs>
-        <w:spacing w:after="80" w:line="276"/>
+        <w:spacing w:after="90" w:line="276"/>
         <w:ind w:left="400"/>
       </w:pPr>
       <w:r>
@@ -943,7 +826,7 @@
           <w:sz w:val="24"/>
           <w:szCs w:val="24"/>
         </w:rPr>
-        <w:t xml:space="preserve">4.2 SwingAssignment.java</w:t>
+        <w:t xml:space="preserve">4.2 RoundedPanel.java</w:t>
       </w:r>
       <w:r>
         <w:rPr>
@@ -961,28 +844,28 @@
         <w:tabs>
           <w:tab w:val="right" w:pos="9026" w:leader="dot"/>
         </w:tabs>
-        <w:spacing w:after="80" w:line="276"/>
-        <w:ind w:left="0"/>
-      </w:pPr>
-      <w:r>
-        <w:rPr>
-          <w:rFonts w:ascii="Tahoma" w:cs="Tahoma" w:eastAsia="Tahoma" w:hAnsi="Tahoma"/>
-          <w:b/>
-          <w:bCs/>
-          <w:sz w:val="24"/>
-          <w:szCs w:val="24"/>
-        </w:rPr>
-        <w:t xml:space="preserve">5. Output Screenshots</w:t>
-      </w:r>
-      <w:r>
-        <w:rPr>
-          <w:rFonts w:ascii="Tahoma" w:cs="Tahoma" w:eastAsia="Tahoma" w:hAnsi="Tahoma"/>
-          <w:b/>
-          <w:bCs/>
-          <w:sz w:val="24"/>
-          <w:szCs w:val="24"/>
-        </w:rPr>
-        <w:t xml:space="preserve">	6</w:t>
+        <w:spacing w:after="90" w:line="276"/>
+        <w:ind w:left="400"/>
+      </w:pPr>
+      <w:r>
+        <w:rPr>
+          <w:rFonts w:ascii="Tahoma" w:cs="Tahoma" w:eastAsia="Tahoma" w:hAnsi="Tahoma"/>
+          <w:b w:val="false"/>
+          <w:bCs w:val="false"/>
+          <w:sz w:val="24"/>
+          <w:szCs w:val="24"/>
+        </w:rPr>
+        <w:t xml:space="preserve">4.3 RoundedButton.java</w:t>
+      </w:r>
+      <w:r>
+        <w:rPr>
+          <w:rFonts w:ascii="Tahoma" w:cs="Tahoma" w:eastAsia="Tahoma" w:hAnsi="Tahoma"/>
+          <w:b w:val="false"/>
+          <w:bCs w:val="false"/>
+          <w:sz w:val="24"/>
+          <w:szCs w:val="24"/>
+        </w:rPr>
+        <w:t xml:space="preserve">	5</w:t>
       </w:r>
     </w:p>
     <w:p>
@@ -990,28 +873,28 @@
         <w:tabs>
           <w:tab w:val="right" w:pos="9026" w:leader="dot"/>
         </w:tabs>
-        <w:spacing w:after="80" w:line="276"/>
-        <w:ind w:left="0"/>
-      </w:pPr>
-      <w:r>
-        <w:rPr>
-          <w:rFonts w:ascii="Tahoma" w:cs="Tahoma" w:eastAsia="Tahoma" w:hAnsi="Tahoma"/>
-          <w:b/>
-          <w:bCs/>
-          <w:sz w:val="24"/>
-          <w:szCs w:val="24"/>
-        </w:rPr>
-        <w:t xml:space="preserve">6. Conclusion</w:t>
-      </w:r>
-      <w:r>
-        <w:rPr>
-          <w:rFonts w:ascii="Tahoma" w:cs="Tahoma" w:eastAsia="Tahoma" w:hAnsi="Tahoma"/>
-          <w:b/>
-          <w:bCs/>
-          <w:sz w:val="24"/>
-          <w:szCs w:val="24"/>
-        </w:rPr>
-        <w:t xml:space="preserve">	7</w:t>
+        <w:spacing w:after="90" w:line="276"/>
+        <w:ind w:left="400"/>
+      </w:pPr>
+      <w:r>
+        <w:rPr>
+          <w:rFonts w:ascii="Tahoma" w:cs="Tahoma" w:eastAsia="Tahoma" w:hAnsi="Tahoma"/>
+          <w:b w:val="false"/>
+          <w:bCs w:val="false"/>
+          <w:sz w:val="24"/>
+          <w:szCs w:val="24"/>
+        </w:rPr>
+        <w:t xml:space="preserve">4.4 ColourSwatch.java</w:t>
+      </w:r>
+      <w:r>
+        <w:rPr>
+          <w:rFonts w:ascii="Tahoma" w:cs="Tahoma" w:eastAsia="Tahoma" w:hAnsi="Tahoma"/>
+          <w:b w:val="false"/>
+          <w:bCs w:val="false"/>
+          <w:sz w:val="24"/>
+          <w:szCs w:val="24"/>
+        </w:rPr>
+        <w:t xml:space="preserve">	6</w:t>
       </w:r>
     </w:p>
     <w:p>
@@ -1019,7 +902,36 @@
         <w:tabs>
           <w:tab w:val="right" w:pos="9026" w:leader="dot"/>
         </w:tabs>
-        <w:spacing w:after="80" w:line="276"/>
+        <w:spacing w:after="90" w:line="276"/>
+        <w:ind w:left="400"/>
+      </w:pPr>
+      <w:r>
+        <w:rPr>
+          <w:rFonts w:ascii="Tahoma" w:cs="Tahoma" w:eastAsia="Tahoma" w:hAnsi="Tahoma"/>
+          <w:b w:val="false"/>
+          <w:bCs w:val="false"/>
+          <w:sz w:val="24"/>
+          <w:szCs w:val="24"/>
+        </w:rPr>
+        <w:t xml:space="preserve">4.5 SwingAssignment.java</w:t>
+      </w:r>
+      <w:r>
+        <w:rPr>
+          <w:rFonts w:ascii="Tahoma" w:cs="Tahoma" w:eastAsia="Tahoma" w:hAnsi="Tahoma"/>
+          <w:b w:val="false"/>
+          <w:bCs w:val="false"/>
+          <w:sz w:val="24"/>
+          <w:szCs w:val="24"/>
+        </w:rPr>
+        <w:t xml:space="preserve">	7</w:t>
+      </w:r>
+    </w:p>
+    <w:p>
+      <w:pPr>
+        <w:tabs>
+          <w:tab w:val="right" w:pos="9026" w:leader="dot"/>
+        </w:tabs>
+        <w:spacing w:after="90" w:line="276"/>
         <w:ind w:left="0"/>
       </w:pPr>
       <w:r>
@@ -1030,7 +942,7 @@
           <w:sz w:val="24"/>
           <w:szCs w:val="24"/>
         </w:rPr>
-        <w:t xml:space="preserve">7. References</w:t>
+        <w:t xml:space="preserve">5. Output Screenshots</w:t>
       </w:r>
       <w:r>
         <w:rPr>
@@ -1040,7 +952,65 @@
           <w:sz w:val="24"/>
           <w:szCs w:val="24"/>
         </w:rPr>
-        <w:t xml:space="preserve">	8</w:t>
+        <w:t xml:space="preserve">	12</w:t>
+      </w:r>
+    </w:p>
+    <w:p>
+      <w:pPr>
+        <w:tabs>
+          <w:tab w:val="right" w:pos="9026" w:leader="dot"/>
+        </w:tabs>
+        <w:spacing w:after="90" w:line="276"/>
+        <w:ind w:left="0"/>
+      </w:pPr>
+      <w:r>
+        <w:rPr>
+          <w:rFonts w:ascii="Tahoma" w:cs="Tahoma" w:eastAsia="Tahoma" w:hAnsi="Tahoma"/>
+          <w:b/>
+          <w:bCs/>
+          <w:sz w:val="24"/>
+          <w:szCs w:val="24"/>
+        </w:rPr>
+        <w:t xml:space="preserve">6. Conclusion</w:t>
+      </w:r>
+      <w:r>
+        <w:rPr>
+          <w:rFonts w:ascii="Tahoma" w:cs="Tahoma" w:eastAsia="Tahoma" w:hAnsi="Tahoma"/>
+          <w:b/>
+          <w:bCs/>
+          <w:sz w:val="24"/>
+          <w:szCs w:val="24"/>
+        </w:rPr>
+        <w:t xml:space="preserve">	15</w:t>
+      </w:r>
+    </w:p>
+    <w:p>
+      <w:pPr>
+        <w:tabs>
+          <w:tab w:val="right" w:pos="9026" w:leader="dot"/>
+        </w:tabs>
+        <w:spacing w:after="90" w:line="276"/>
+        <w:ind w:left="0"/>
+      </w:pPr>
+      <w:r>
+        <w:rPr>
+          <w:rFonts w:ascii="Tahoma" w:cs="Tahoma" w:eastAsia="Tahoma" w:hAnsi="Tahoma"/>
+          <w:b/>
+          <w:bCs/>
+          <w:sz w:val="24"/>
+          <w:szCs w:val="24"/>
+        </w:rPr>
+        <w:t xml:space="preserve">7. References</w:t>
+      </w:r>
+      <w:r>
+        <w:rPr>
+          <w:rFonts w:ascii="Tahoma" w:cs="Tahoma" w:eastAsia="Tahoma" w:hAnsi="Tahoma"/>
+          <w:b/>
+          <w:bCs/>
+          <w:sz w:val="24"/>
+          <w:szCs w:val="24"/>
+        </w:rPr>
+        <w:t xml:space="preserve">	15</w:t>
       </w:r>
     </w:p>
     <w:p>
@@ -1068,7 +1038,7 @@
     </w:p>
     <w:p>
       <w:pPr>
-        <w:spacing w:after="120" w:line="276"/>
+        <w:spacing w:after="140" w:line="276"/>
         <w:jc w:val="both"/>
       </w:pPr>
       <w:r>
@@ -1082,7 +1052,7 @@
     </w:p>
     <w:p>
       <w:pPr>
-        <w:spacing w:after="120" w:line="276"/>
+        <w:spacing w:after="140" w:line="276"/>
         <w:jc w:val="both"/>
       </w:pPr>
       <w:r>
@@ -1091,12 +1061,12 @@
           <w:sz w:val="24"/>
           <w:szCs w:val="24"/>
         </w:rPr>
-        <w:t xml:space="preserve">Java Swing is the GUI toolkit included in the Java Standard Edition. It provides ready-made components such as windows, panels, labels, text fields and buttons. In Swing, a JFrame is the main window of the application, a JPanel is a container used to group and arrange components, and a JLabel displays a short piece of text and/or an image. An ImageIcon loads an image file so it can be displayed on a component or used as the application icon.</w:t>
-      </w:r>
-    </w:p>
-    <w:p>
-      <w:pPr>
-        <w:spacing w:after="120" w:line="276"/>
+        <w:t xml:space="preserve">Java Swing is the GUI toolkit included in the Java Standard Edition. In Swing, a JFrame is the main window of an application, a JPanel is a container used to group and arrange components, and a JLabel displays text and/or an image. An ImageIcon loads an image file so it can be shown on a component or used as the application icon.</w:t>
+      </w:r>
+    </w:p>
+    <w:p>
+      <w:pPr>
+        <w:spacing w:after="140" w:line="276"/>
         <w:jc w:val="both"/>
       </w:pPr>
       <w:r>
@@ -1105,7 +1075,7 @@
           <w:sz w:val="24"/>
           <w:szCs w:val="24"/>
         </w:rPr>
-        <w:t xml:space="preserve">This document presents a basic interactive GUI application developed for the PROG209 Event Driven Programming individual assignment. The application opens an 800 x 800 window titled "Java Swing Assignment" with a custom application icon and displays the message "Welcome to Java Swing First Individual Assignment by Sahr". The program applies the object-oriented concepts of inheritance and constructors. As an addition, the user can change the text of the JLabel and the background colour of the JPanel at run time.</w:t>
+        <w:t xml:space="preserve">This document presents the interactive GUI application developed for the PROG209 individual assignment. The application opens an 800 x 800 window titled "Java Swing Assignment" with a custom application logo and displays the message "Welcome to Java Swing First Individual Assignment by Sahr". It uses a modern dark design with rounded cards and gradient buttons. The user can change the text of the JLabel and change the background colour of the JPanel, either with one-click colour circles or with a full colour picker. The program applies inheritance and constructors throughout.</w:t>
       </w:r>
     </w:p>
     <w:p>
@@ -1118,7 +1088,7 @@
     </w:p>
     <w:p>
       <w:pPr>
-        <w:spacing w:after="120" w:line="276"/>
+        <w:spacing w:after="140" w:line="276"/>
         <w:jc w:val="both"/>
       </w:pPr>
       <w:r>
@@ -1297,7 +1267,7 @@
     </w:p>
     <w:p>
       <w:pPr>
-        <w:spacing w:after="120" w:line="276"/>
+        <w:spacing w:after="140" w:line="276"/>
         <w:jc w:val="both"/>
       </w:pPr>
       <w:r>
@@ -1306,7 +1276,7 @@
           <w:sz w:val="24"/>
           <w:szCs w:val="24"/>
         </w:rPr>
-        <w:t xml:space="preserve">Before writing any code, a wireframe was designed in Figma to plan the layout of the window. A wireframe is a simple, low-fidelity sketch that shows where each element will be placed without focusing on colours or final styling. The Figma frame was set to 800 x 800 pixels to match the size of the JFrame.</w:t>
+        <w:t xml:space="preserve">Before writing any code, a wireframe was designed in Figma to plan the layout of the window. A wireframe is a simple, low-fidelity sketch that shows where each element will be placed without focusing on colours or final styling. The Figma frame was set to 800 x 800 pixels to match the size of the JFrame. It shows the title bar, the header with the logo, the JLabel card with the image and welcome text, and the controls card with the text field, the colour circles and the buttons.</w:t>
       </w:r>
     </w:p>
     <w:p>
@@ -1318,9 +1288,9 @@
       <w:r>
         <w:drawing>
           <wp:inline distT="0" distB="0" distL="0" distR="0">
-            <wp:extent cx="3429000" cy="3429000"/>
+            <wp:extent cx="4095750" cy="4095750"/>
             <wp:effectExtent t="0" r="0" b="0" l="0"/>
-            <wp:docPr id="1" name="wireframe-reference.png" descr="Figure 1: Wireframe of the application layout" title="Figure 1: Wireframe of the application layout"/>
+            <wp:docPr id="1" name="wireframe.png" descr="Figure 1: Figma wireframe of the application layout" title="Figure 1: Figma wireframe of the application layout"/>
             <wp:cNvGraphicFramePr>
               <a:graphicFrameLocks xmlns:a="http://schemas.openxmlformats.org/drawingml/2006/main" noChangeAspect="1"/>
             </wp:cNvGraphicFramePr>
@@ -1343,7 +1313,7 @@
                   <pic:spPr bwMode="auto">
                     <a:xfrm>
                       <a:off x="0" y="0"/>
-                      <a:ext cx="3429000" cy="3429000"/>
+                      <a:ext cx="4095750" cy="4095750"/>
                     </a:xfrm>
                     <a:prstGeom prst="rect">
                       <a:avLst/>
@@ -1358,7 +1328,7 @@
     </w:p>
     <w:p>
       <w:pPr>
-        <w:spacing w:after="200"/>
+        <w:spacing w:after="220"/>
         <w:jc w:val="center"/>
       </w:pPr>
       <w:r>
@@ -1369,17 +1339,17 @@
           <w:sz w:val="24"/>
           <w:szCs w:val="24"/>
         </w:rPr>
-        <w:t xml:space="preserve">Figure 1: Wireframe of the application layout</w:t>
-      </w:r>
-    </w:p>
-    <w:p>
-      <w:pPr>
-        <w:spacing w:after="120" w:line="276" w:lineRule="auto"/>
+        <w:t xml:space="preserve">Figure 1: Figma wireframe of the application layout</w:t>
+      </w:r>
+    </w:p>
+    <w:p>
+      <w:pPr>
+        <w:spacing w:after="140" w:line="276"/>
         <w:jc w:val="both"/>
       </w:pPr>
       <w:r>
         <w:rPr>
-          <w:rFonts w:ascii="Tahoma" w:hAnsi="Tahoma" w:cs="Tahoma" w:eastAsia="Tahoma"/>
+          <w:rFonts w:ascii="Tahoma" w:cs="Tahoma" w:eastAsia="Tahoma" w:hAnsi="Tahoma"/>
           <w:sz w:val="24"/>
           <w:szCs w:val="24"/>
         </w:rPr>
@@ -1401,7 +1371,7 @@
     </w:p>
     <w:p>
       <w:pPr>
-        <w:spacing w:after="120" w:line="276"/>
+        <w:spacing w:after="140" w:line="276"/>
         <w:jc w:val="both"/>
       </w:pPr>
       <w:r>
@@ -1410,7 +1380,7 @@
           <w:sz w:val="24"/>
           <w:szCs w:val="24"/>
         </w:rPr>
-        <w:t xml:space="preserve">The complete source code is shown below and is also available in the GitHub repository. The project is organised with both Java files and the icon inside the src folder.</w:t>
+        <w:t xml:space="preserve">The program is made up of five classes, all stored in the src folder together with the logo image. BaseWindow is the parent class that creates the JFrame. SwingAssignment extends BaseWindow and builds the interface. RoundedPanel, RoundedButton and ColourSwatch extend Swing classes (JPanel and JButton) to give the interface its modern look, which shows further use of inheritance.</w:t>
       </w:r>
     </w:p>
     <w:p>
@@ -1430,9 +1400,9 @@
       <w:r>
         <w:drawing>
           <wp:inline distT="0" distB="0" distL="0" distR="0">
-            <wp:extent cx="4762500" cy="4857750"/>
+            <wp:extent cx="4572000" cy="4943475"/>
             <wp:effectExtent t="0" r="0" b="0" l="0"/>
-            <wp:docPr id="1" name="code_BaseWindow.png" descr="Figure 2: Source code of BaseWindow.java" title="Figure 2: Source code of BaseWindow.java"/>
+            <wp:docPr id="1" name="BaseWindow_1.png" descr="Figure 2: Source code of BaseWindow.java" title="Figure 2: Source code of BaseWindow.java"/>
             <wp:cNvGraphicFramePr>
               <a:graphicFrameLocks xmlns:a="http://schemas.openxmlformats.org/drawingml/2006/main" noChangeAspect="1"/>
             </wp:cNvGraphicFramePr>
@@ -1455,7 +1425,7 @@
                   <pic:spPr bwMode="auto">
                     <a:xfrm>
                       <a:off x="0" y="0"/>
-                      <a:ext cx="4762500" cy="4857750"/>
+                      <a:ext cx="4572000" cy="4943475"/>
                     </a:xfrm>
                     <a:prstGeom prst="rect">
                       <a:avLst/>
@@ -1470,7 +1440,7 @@
     </w:p>
     <w:p>
       <w:pPr>
-        <w:spacing w:after="200"/>
+        <w:spacing w:after="220"/>
         <w:jc w:val="center"/>
       </w:pPr>
       <w:r>
@@ -1494,7 +1464,7 @@
         <w:pStyle w:val="Heading2"/>
       </w:pPr>
       <w:r>
-        <w:t xml:space="preserve">4.2 SwingAssignment.java</w:t>
+        <w:t xml:space="preserve">4.2 RoundedPanel.java</w:t>
       </w:r>
     </w:p>
     <w:p>
@@ -1506,9 +1476,9 @@
       <w:r>
         <w:drawing>
           <wp:inline distT="0" distB="0" distL="0" distR="0">
-            <wp:extent cx="4476750" cy="5562600"/>
+            <wp:extent cx="4572000" cy="3162300"/>
             <wp:effectExtent t="0" r="0" b="0" l="0"/>
-            <wp:docPr id="1" name="code_SA1.png" descr="Figure 3: Source code of SwingAssignment.java (part 1)" title="Figure 3: Source code of SwingAssignment.java (part 1)"/>
+            <wp:docPr id="1" name="RoundedPanel_1.png" descr="Figure 3: Source code of RoundedPanel.java" title="Figure 3: Source code of RoundedPanel.java"/>
             <wp:cNvGraphicFramePr>
               <a:graphicFrameLocks xmlns:a="http://schemas.openxmlformats.org/drawingml/2006/main" noChangeAspect="1"/>
             </wp:cNvGraphicFramePr>
@@ -1531,7 +1501,7 @@
                   <pic:spPr bwMode="auto">
                     <a:xfrm>
                       <a:off x="0" y="0"/>
-                      <a:ext cx="4476750" cy="5562600"/>
+                      <a:ext cx="4572000" cy="3162300"/>
                     </a:xfrm>
                     <a:prstGeom prst="rect">
                       <a:avLst/>
@@ -1546,7 +1516,7 @@
     </w:p>
     <w:p>
       <w:pPr>
-        <w:spacing w:after="200"/>
+        <w:spacing w:after="220"/>
         <w:jc w:val="center"/>
       </w:pPr>
       <w:r>
@@ -1557,7 +1527,20 @@
           <w:sz w:val="24"/>
           <w:szCs w:val="24"/>
         </w:rPr>
-        <w:t xml:space="preserve">Figure 3: Source code of SwingAssignment.java (part 1)</w:t>
+        <w:t xml:space="preserve">Figure 3: Source code of RoundedPanel.java</w:t>
+      </w:r>
+    </w:p>
+    <w:p>
+      <w:r>
+        <w:br w:type="page"/>
+      </w:r>
+    </w:p>
+    <w:p>
+      <w:pPr>
+        <w:pStyle w:val="Heading2"/>
+      </w:pPr>
+      <w:r>
+        <w:t xml:space="preserve">4.3 RoundedButton.java</w:t>
       </w:r>
     </w:p>
     <w:p>
@@ -1569,9 +1552,9 @@
       <w:r>
         <w:drawing>
           <wp:inline distT="0" distB="0" distL="0" distR="0">
-            <wp:extent cx="4476750" cy="6086475"/>
+            <wp:extent cx="4476750" cy="5753100"/>
             <wp:effectExtent t="0" r="0" b="0" l="0"/>
-            <wp:docPr id="1" name="code_SA2.png" descr="Figure 4: Source code of SwingAssignment.java (part 2)" title="Figure 4: Source code of SwingAssignment.java (part 2)"/>
+            <wp:docPr id="1" name="RoundedButton_1.png" descr="Figure 4: Source code of RoundedButton.java" title="Figure 4: Source code of RoundedButton.java"/>
             <wp:cNvGraphicFramePr>
               <a:graphicFrameLocks xmlns:a="http://schemas.openxmlformats.org/drawingml/2006/main" noChangeAspect="1"/>
             </wp:cNvGraphicFramePr>
@@ -1594,7 +1577,7 @@
                   <pic:spPr bwMode="auto">
                     <a:xfrm>
                       <a:off x="0" y="0"/>
-                      <a:ext cx="4476750" cy="6086475"/>
+                      <a:ext cx="4476750" cy="5753100"/>
                     </a:xfrm>
                     <a:prstGeom prst="rect">
                       <a:avLst/>
@@ -1609,7 +1592,7 @@
     </w:p>
     <w:p>
       <w:pPr>
-        <w:spacing w:after="200"/>
+        <w:spacing w:after="220"/>
         <w:jc w:val="center"/>
       </w:pPr>
       <w:r>
@@ -1620,7 +1603,7 @@
           <w:sz w:val="24"/>
           <w:szCs w:val="24"/>
         </w:rPr>
-        <w:t xml:space="preserve">Figure 4: Source code of SwingAssignment.java (part 2)</w:t>
+        <w:t xml:space="preserve">Figure 4: Source code of RoundedButton.java</w:t>
       </w:r>
     </w:p>
     <w:p>
@@ -1630,24 +1613,10 @@
     </w:p>
     <w:p>
       <w:pPr>
-        <w:pStyle w:val="Heading1"/>
-      </w:pPr>
-      <w:r>
-        <w:t xml:space="preserve">5. Output Screenshots</w:t>
-      </w:r>
-    </w:p>
-    <w:p>
-      <w:pPr>
-        <w:spacing w:after="120" w:line="276"/>
-        <w:jc w:val="both"/>
-      </w:pPr>
-      <w:r>
-        <w:rPr>
-          <w:rFonts w:ascii="Tahoma" w:cs="Tahoma" w:eastAsia="Tahoma" w:hAnsi="Tahoma"/>
-          <w:sz w:val="24"/>
-          <w:szCs w:val="24"/>
-        </w:rPr>
-        <w:t xml:space="preserve">The following screenshots show the application running and each feature working.</w:t>
+        <w:pStyle w:val="Heading2"/>
+      </w:pPr>
+      <w:r>
+        <w:t xml:space="preserve">4.4 ColourSwatch.java</w:t>
       </w:r>
     </w:p>
     <w:p>
@@ -1659,9 +1628,9 @@
       <w:r>
         <w:drawing>
           <wp:inline distT="0" distB="0" distL="0" distR="0">
-            <wp:extent cx="3048000" cy="3048000"/>
+            <wp:extent cx="4572000" cy="4200525"/>
             <wp:effectExtent t="0" r="0" b="0" l="0"/>
-            <wp:docPr id="1" name="shot1.png" descr="Figure 5: Application on launch, showing the title, icon, image and welcome message" title="Figure 5: Application on launch, showing the title, icon, image and welcome message"/>
+            <wp:docPr id="1" name="ColourSwatch_1.png" descr="Figure 5: Source code of ColourSwatch.java" title="Figure 5: Source code of ColourSwatch.java"/>
             <wp:cNvGraphicFramePr>
               <a:graphicFrameLocks xmlns:a="http://schemas.openxmlformats.org/drawingml/2006/main" noChangeAspect="1"/>
             </wp:cNvGraphicFramePr>
@@ -1684,7 +1653,7 @@
                   <pic:spPr bwMode="auto">
                     <a:xfrm>
                       <a:off x="0" y="0"/>
-                      <a:ext cx="3048000" cy="3048000"/>
+                      <a:ext cx="4572000" cy="4200525"/>
                     </a:xfrm>
                     <a:prstGeom prst="rect">
                       <a:avLst/>
@@ -1699,7 +1668,7 @@
     </w:p>
     <w:p>
       <w:pPr>
-        <w:spacing w:after="200"/>
+        <w:spacing w:after="220"/>
         <w:jc w:val="center"/>
       </w:pPr>
       <w:r>
@@ -1710,7 +1679,20 @@
           <w:sz w:val="24"/>
           <w:szCs w:val="24"/>
         </w:rPr>
-        <w:t xml:space="preserve">Figure 5: Application on launch, showing the title, icon, image and welcome message</w:t>
+        <w:t xml:space="preserve">Figure 5: Source code of ColourSwatch.java</w:t>
+      </w:r>
+    </w:p>
+    <w:p>
+      <w:r>
+        <w:br w:type="page"/>
+      </w:r>
+    </w:p>
+    <w:p>
+      <w:pPr>
+        <w:pStyle w:val="Heading2"/>
+      </w:pPr>
+      <w:r>
+        <w:t xml:space="preserve">4.5 SwingAssignment.java</w:t>
       </w:r>
     </w:p>
     <w:p>
@@ -1722,9 +1704,9 @@
       <w:r>
         <w:drawing>
           <wp:inline distT="0" distB="0" distL="0" distR="0">
-            <wp:extent cx="3048000" cy="3048000"/>
+            <wp:extent cx="4476750" cy="5734050"/>
             <wp:effectExtent t="0" r="0" b="0" l="0"/>
-            <wp:docPr id="1" name="shot2a.png" descr="Figure 6: New text typed into the text field before clicking Change Text" title="Figure 6: New text typed into the text field before clicking Change Text"/>
+            <wp:docPr id="1" name="SwingAssignment_1.png" descr="Figure 6: Source code of SwingAssignment.java (part 1)" title="Figure 6: Source code of SwingAssignment.java (part 1)"/>
             <wp:cNvGraphicFramePr>
               <a:graphicFrameLocks xmlns:a="http://schemas.openxmlformats.org/drawingml/2006/main" noChangeAspect="1"/>
             </wp:cNvGraphicFramePr>
@@ -1747,7 +1729,7 @@
                   <pic:spPr bwMode="auto">
                     <a:xfrm>
                       <a:off x="0" y="0"/>
-                      <a:ext cx="3048000" cy="3048000"/>
+                      <a:ext cx="4476750" cy="5734050"/>
                     </a:xfrm>
                     <a:prstGeom prst="rect">
                       <a:avLst/>
@@ -1762,7 +1744,7 @@
     </w:p>
     <w:p>
       <w:pPr>
-        <w:spacing w:after="200"/>
+        <w:spacing w:after="220"/>
         <w:jc w:val="center"/>
       </w:pPr>
       <w:r>
@@ -1773,7 +1755,12 @@
           <w:sz w:val="24"/>
           <w:szCs w:val="24"/>
         </w:rPr>
-        <w:t xml:space="preserve">Figure 6: New text typed into the text field before clicking Change Text</w:t>
+        <w:t xml:space="preserve">Figure 6: Source code of SwingAssignment.java (part 1)</w:t>
+      </w:r>
+    </w:p>
+    <w:p>
+      <w:r>
+        <w:br w:type="page"/>
       </w:r>
     </w:p>
     <w:p>
@@ -1785,9 +1772,9 @@
       <w:r>
         <w:drawing>
           <wp:inline distT="0" distB="0" distL="0" distR="0">
-            <wp:extent cx="3048000" cy="3048000"/>
+            <wp:extent cx="4476750" cy="5210175"/>
             <wp:effectExtent t="0" r="0" b="0" l="0"/>
-            <wp:docPr id="1" name="shot2.png" descr="Figure 7: Label text changed after clicking Change Text" title="Figure 7: Label text changed after clicking Change Text"/>
+            <wp:docPr id="1" name="SwingAssignment_2.png" descr="Figure 7: Source code of SwingAssignment.java (part 2)" title="Figure 7: Source code of SwingAssignment.java (part 2)"/>
             <wp:cNvGraphicFramePr>
               <a:graphicFrameLocks xmlns:a="http://schemas.openxmlformats.org/drawingml/2006/main" noChangeAspect="1"/>
             </wp:cNvGraphicFramePr>
@@ -1810,7 +1797,7 @@
                   <pic:spPr bwMode="auto">
                     <a:xfrm>
                       <a:off x="0" y="0"/>
-                      <a:ext cx="3048000" cy="3048000"/>
+                      <a:ext cx="4476750" cy="5210175"/>
                     </a:xfrm>
                     <a:prstGeom prst="rect">
                       <a:avLst/>
@@ -1825,7 +1812,7 @@
     </w:p>
     <w:p>
       <w:pPr>
-        <w:spacing w:after="200"/>
+        <w:spacing w:after="220"/>
         <w:jc w:val="center"/>
       </w:pPr>
       <w:r>
@@ -1836,7 +1823,12 @@
           <w:sz w:val="24"/>
           <w:szCs w:val="24"/>
         </w:rPr>
-        <w:t xml:space="preserve">Figure 7: Label text changed after clicking Change Text</w:t>
+        <w:t xml:space="preserve">Figure 7: Source code of SwingAssignment.java (part 2)</w:t>
+      </w:r>
+    </w:p>
+    <w:p>
+      <w:r>
+        <w:br w:type="page"/>
       </w:r>
     </w:p>
     <w:p>
@@ -1848,9 +1840,9 @@
       <w:r>
         <w:drawing>
           <wp:inline distT="0" distB="0" distL="0" distR="0">
-            <wp:extent cx="3048000" cy="3048000"/>
+            <wp:extent cx="4476750" cy="5867400"/>
             <wp:effectExtent t="0" r="0" b="0" l="0"/>
-            <wp:docPr id="1" name="shot3.png" descr="Figure 8: Panel background changed after choosing a colour with Change Background" title="Figure 8: Panel background changed after choosing a colour with Change Background"/>
+            <wp:docPr id="1" name="SwingAssignment_3.png" descr="Figure 8: Source code of SwingAssignment.java (part 3)" title="Figure 8: Source code of SwingAssignment.java (part 3)"/>
             <wp:cNvGraphicFramePr>
               <a:graphicFrameLocks xmlns:a="http://schemas.openxmlformats.org/drawingml/2006/main" noChangeAspect="1"/>
             </wp:cNvGraphicFramePr>
@@ -1873,7 +1865,7 @@
                   <pic:spPr bwMode="auto">
                     <a:xfrm>
                       <a:off x="0" y="0"/>
-                      <a:ext cx="3048000" cy="3048000"/>
+                      <a:ext cx="4476750" cy="5867400"/>
                     </a:xfrm>
                     <a:prstGeom prst="rect">
                       <a:avLst/>
@@ -1888,7 +1880,7 @@
     </w:p>
     <w:p>
       <w:pPr>
-        <w:spacing w:after="200"/>
+        <w:spacing w:after="220"/>
         <w:jc w:val="center"/>
       </w:pPr>
       <w:r>
@@ -1899,7 +1891,148 @@
           <w:sz w:val="24"/>
           <w:szCs w:val="24"/>
         </w:rPr>
-        <w:t xml:space="preserve">Figure 8: Panel background changed after choosing a colour with Change Background</w:t>
+        <w:t xml:space="preserve">Figure 8: Source code of SwingAssignment.java (part 3)</w:t>
+      </w:r>
+    </w:p>
+    <w:p>
+      <w:r>
+        <w:br w:type="page"/>
+      </w:r>
+    </w:p>
+    <w:p>
+      <w:pPr>
+        <w:keepNext/>
+        <w:spacing w:after="60" w:before="120"/>
+        <w:jc w:val="center"/>
+      </w:pPr>
+      <w:r>
+        <w:drawing>
+          <wp:inline distT="0" distB="0" distL="0" distR="0">
+            <wp:extent cx="4476750" cy="5591175"/>
+            <wp:effectExtent t="0" r="0" b="0" l="0"/>
+            <wp:docPr id="1" name="SwingAssignment_4.png" descr="Figure 9: Source code of SwingAssignment.java (part 4)" title="Figure 9: Source code of SwingAssignment.java (part 4)"/>
+            <wp:cNvGraphicFramePr>
+              <a:graphicFrameLocks xmlns:a="http://schemas.openxmlformats.org/drawingml/2006/main" noChangeAspect="1"/>
+            </wp:cNvGraphicFramePr>
+            <a:graphic xmlns:a="http://schemas.openxmlformats.org/drawingml/2006/main">
+              <a:graphicData uri="http://schemas.openxmlformats.org/drawingml/2006/picture">
+                <pic:pic xmlns:pic="http://schemas.openxmlformats.org/drawingml/2006/picture">
+                  <pic:nvPicPr>
+                    <pic:cNvPr id="0" name="" descr=""/>
+                    <pic:cNvPicPr>
+                      <a:picLocks noChangeAspect="1" noChangeArrowheads="1"/>
+                    </pic:cNvPicPr>
+                  </pic:nvPicPr>
+                  <pic:blipFill>
+                    <a:blip r:embed="rId17" cstate="none"/>
+                    <a:srcRect/>
+                    <a:stretch>
+                      <a:fillRect/>
+                    </a:stretch>
+                  </pic:blipFill>
+                  <pic:spPr bwMode="auto">
+                    <a:xfrm>
+                      <a:off x="0" y="0"/>
+                      <a:ext cx="4476750" cy="5591175"/>
+                    </a:xfrm>
+                    <a:prstGeom prst="rect">
+                      <a:avLst/>
+                    </a:prstGeom>
+                  </pic:spPr>
+                </pic:pic>
+              </a:graphicData>
+            </a:graphic>
+          </wp:inline>
+        </w:drawing>
+      </w:r>
+    </w:p>
+    <w:p>
+      <w:pPr>
+        <w:spacing w:after="220"/>
+        <w:jc w:val="center"/>
+      </w:pPr>
+      <w:r>
+        <w:rPr>
+          <w:rFonts w:ascii="Tahoma" w:cs="Tahoma" w:eastAsia="Tahoma" w:hAnsi="Tahoma"/>
+          <w:i/>
+          <w:iCs/>
+          <w:sz w:val="24"/>
+          <w:szCs w:val="24"/>
+        </w:rPr>
+        <w:t xml:space="preserve">Figure 9: Source code of SwingAssignment.java (part 4)</w:t>
+      </w:r>
+    </w:p>
+    <w:p>
+      <w:r>
+        <w:br w:type="page"/>
+      </w:r>
+    </w:p>
+    <w:p>
+      <w:pPr>
+        <w:keepNext/>
+        <w:spacing w:after="60" w:before="120"/>
+        <w:jc w:val="center"/>
+      </w:pPr>
+      <w:r>
+        <w:drawing>
+          <wp:inline distT="0" distB="0" distL="0" distR="0">
+            <wp:extent cx="4476750" cy="3905250"/>
+            <wp:effectExtent t="0" r="0" b="0" l="0"/>
+            <wp:docPr id="1" name="SwingAssignment_5.png" descr="Figure 10: Source code of SwingAssignment.java (part 5)" title="Figure 10: Source code of SwingAssignment.java (part 5)"/>
+            <wp:cNvGraphicFramePr>
+              <a:graphicFrameLocks xmlns:a="http://schemas.openxmlformats.org/drawingml/2006/main" noChangeAspect="1"/>
+            </wp:cNvGraphicFramePr>
+            <a:graphic xmlns:a="http://schemas.openxmlformats.org/drawingml/2006/main">
+              <a:graphicData uri="http://schemas.openxmlformats.org/drawingml/2006/picture">
+                <pic:pic xmlns:pic="http://schemas.openxmlformats.org/drawingml/2006/picture">
+                  <pic:nvPicPr>
+                    <pic:cNvPr id="0" name="" descr=""/>
+                    <pic:cNvPicPr>
+                      <a:picLocks noChangeAspect="1" noChangeArrowheads="1"/>
+                    </pic:cNvPicPr>
+                  </pic:nvPicPr>
+                  <pic:blipFill>
+                    <a:blip r:embed="rId18" cstate="none"/>
+                    <a:srcRect/>
+                    <a:stretch>
+                      <a:fillRect/>
+                    </a:stretch>
+                  </pic:blipFill>
+                  <pic:spPr bwMode="auto">
+                    <a:xfrm>
+                      <a:off x="0" y="0"/>
+                      <a:ext cx="4476750" cy="3905250"/>
+                    </a:xfrm>
+                    <a:prstGeom prst="rect">
+                      <a:avLst/>
+                    </a:prstGeom>
+                  </pic:spPr>
+                </pic:pic>
+              </a:graphicData>
+            </a:graphic>
+          </wp:inline>
+        </w:drawing>
+      </w:r>
+    </w:p>
+    <w:p>
+      <w:pPr>
+        <w:spacing w:after="220"/>
+        <w:jc w:val="center"/>
+      </w:pPr>
+      <w:r>
+        <w:rPr>
+          <w:rFonts w:ascii="Tahoma" w:cs="Tahoma" w:eastAsia="Tahoma" w:hAnsi="Tahoma"/>
+          <w:i/>
+          <w:iCs/>
+          <w:sz w:val="24"/>
+          <w:szCs w:val="24"/>
+        </w:rPr>
+        <w:t xml:space="preserve">Figure 10: Source code of SwingAssignment.java (part 5)</w:t>
+      </w:r>
+    </w:p>
+    <w:p>
+      <w:r>
+        <w:br w:type="page"/>
       </w:r>
     </w:p>
     <w:p>
@@ -1907,12 +2040,354 @@
         <w:pStyle w:val="Heading1"/>
       </w:pPr>
       <w:r>
+        <w:t xml:space="preserve">5. Output Screenshots</w:t>
+      </w:r>
+    </w:p>
+    <w:p>
+      <w:pPr>
+        <w:spacing w:after="140" w:line="276"/>
+        <w:jc w:val="both"/>
+      </w:pPr>
+      <w:r>
+        <w:rPr>
+          <w:rFonts w:ascii="Tahoma" w:cs="Tahoma" w:eastAsia="Tahoma" w:hAnsi="Tahoma"/>
+          <w:sz w:val="24"/>
+          <w:szCs w:val="24"/>
+        </w:rPr>
+        <w:t xml:space="preserve">The following screenshots show the application running and each feature working.</w:t>
+      </w:r>
+    </w:p>
+    <w:p>
+      <w:pPr>
+        <w:keepNext/>
+        <w:spacing w:after="60" w:before="120"/>
+        <w:jc w:val="center"/>
+      </w:pPr>
+      <w:r>
+        <w:drawing>
+          <wp:inline distT="0" distB="0" distL="0" distR="0">
+            <wp:extent cx="3238500" cy="3238500"/>
+            <wp:effectExtent t="0" r="0" b="0" l="0"/>
+            <wp:docPr id="1" name="01-launch.png" descr="Figure 11: Application on launch with the title, logo and welcome message" title="Figure 11: Application on launch with the title, logo and welcome message"/>
+            <wp:cNvGraphicFramePr>
+              <a:graphicFrameLocks xmlns:a="http://schemas.openxmlformats.org/drawingml/2006/main" noChangeAspect="1"/>
+            </wp:cNvGraphicFramePr>
+            <a:graphic xmlns:a="http://schemas.openxmlformats.org/drawingml/2006/main">
+              <a:graphicData uri="http://schemas.openxmlformats.org/drawingml/2006/picture">
+                <pic:pic xmlns:pic="http://schemas.openxmlformats.org/drawingml/2006/picture">
+                  <pic:nvPicPr>
+                    <pic:cNvPr id="0" name="" descr=""/>
+                    <pic:cNvPicPr>
+                      <a:picLocks noChangeAspect="1" noChangeArrowheads="1"/>
+                    </pic:cNvPicPr>
+                  </pic:nvPicPr>
+                  <pic:blipFill>
+                    <a:blip r:embed="rId19" cstate="none"/>
+                    <a:srcRect/>
+                    <a:stretch>
+                      <a:fillRect/>
+                    </a:stretch>
+                  </pic:blipFill>
+                  <pic:spPr bwMode="auto">
+                    <a:xfrm>
+                      <a:off x="0" y="0"/>
+                      <a:ext cx="3238500" cy="3238500"/>
+                    </a:xfrm>
+                    <a:prstGeom prst="rect">
+                      <a:avLst/>
+                    </a:prstGeom>
+                  </pic:spPr>
+                </pic:pic>
+              </a:graphicData>
+            </a:graphic>
+          </wp:inline>
+        </w:drawing>
+      </w:r>
+    </w:p>
+    <w:p>
+      <w:pPr>
+        <w:spacing w:after="220"/>
+        <w:jc w:val="center"/>
+      </w:pPr>
+      <w:r>
+        <w:rPr>
+          <w:rFonts w:ascii="Tahoma" w:cs="Tahoma" w:eastAsia="Tahoma" w:hAnsi="Tahoma"/>
+          <w:i/>
+          <w:iCs/>
+          <w:sz w:val="24"/>
+          <w:szCs w:val="24"/>
+        </w:rPr>
+        <w:t xml:space="preserve">Figure 11: Application on launch with the title, logo and welcome message</w:t>
+      </w:r>
+    </w:p>
+    <w:p>
+      <w:pPr>
+        <w:keepNext/>
+        <w:spacing w:after="60" w:before="120"/>
+        <w:jc w:val="center"/>
+      </w:pPr>
+      <w:r>
+        <w:drawing>
+          <wp:inline distT="0" distB="0" distL="0" distR="0">
+            <wp:extent cx="3238500" cy="3238500"/>
+            <wp:effectExtent t="0" r="0" b="0" l="0"/>
+            <wp:docPr id="1" name="02-typing-text.png" descr="Figure 12: New text typed into the text field" title="Figure 12: New text typed into the text field"/>
+            <wp:cNvGraphicFramePr>
+              <a:graphicFrameLocks xmlns:a="http://schemas.openxmlformats.org/drawingml/2006/main" noChangeAspect="1"/>
+            </wp:cNvGraphicFramePr>
+            <a:graphic xmlns:a="http://schemas.openxmlformats.org/drawingml/2006/main">
+              <a:graphicData uri="http://schemas.openxmlformats.org/drawingml/2006/picture">
+                <pic:pic xmlns:pic="http://schemas.openxmlformats.org/drawingml/2006/picture">
+                  <pic:nvPicPr>
+                    <pic:cNvPr id="0" name="" descr=""/>
+                    <pic:cNvPicPr>
+                      <a:picLocks noChangeAspect="1" noChangeArrowheads="1"/>
+                    </pic:cNvPicPr>
+                  </pic:nvPicPr>
+                  <pic:blipFill>
+                    <a:blip r:embed="rId20" cstate="none"/>
+                    <a:srcRect/>
+                    <a:stretch>
+                      <a:fillRect/>
+                    </a:stretch>
+                  </pic:blipFill>
+                  <pic:spPr bwMode="auto">
+                    <a:xfrm>
+                      <a:off x="0" y="0"/>
+                      <a:ext cx="3238500" cy="3238500"/>
+                    </a:xfrm>
+                    <a:prstGeom prst="rect">
+                      <a:avLst/>
+                    </a:prstGeom>
+                  </pic:spPr>
+                </pic:pic>
+              </a:graphicData>
+            </a:graphic>
+          </wp:inline>
+        </w:drawing>
+      </w:r>
+    </w:p>
+    <w:p>
+      <w:pPr>
+        <w:spacing w:after="220"/>
+        <w:jc w:val="center"/>
+      </w:pPr>
+      <w:r>
+        <w:rPr>
+          <w:rFonts w:ascii="Tahoma" w:cs="Tahoma" w:eastAsia="Tahoma" w:hAnsi="Tahoma"/>
+          <w:i/>
+          <w:iCs/>
+          <w:sz w:val="24"/>
+          <w:szCs w:val="24"/>
+        </w:rPr>
+        <w:t xml:space="preserve">Figure 12: New text typed into the text field</w:t>
+      </w:r>
+    </w:p>
+    <w:p>
+      <w:pPr>
+        <w:keepNext/>
+        <w:spacing w:after="60" w:before="120"/>
+        <w:jc w:val="center"/>
+      </w:pPr>
+      <w:r>
+        <w:drawing>
+          <wp:inline distT="0" distB="0" distL="0" distR="0">
+            <wp:extent cx="3238500" cy="3238500"/>
+            <wp:effectExtent t="0" r="0" b="0" l="0"/>
+            <wp:docPr id="1" name="03-text-changed.png" descr="Figure 13: Label text changed after clicking Change Text" title="Figure 13: Label text changed after clicking Change Text"/>
+            <wp:cNvGraphicFramePr>
+              <a:graphicFrameLocks xmlns:a="http://schemas.openxmlformats.org/drawingml/2006/main" noChangeAspect="1"/>
+            </wp:cNvGraphicFramePr>
+            <a:graphic xmlns:a="http://schemas.openxmlformats.org/drawingml/2006/main">
+              <a:graphicData uri="http://schemas.openxmlformats.org/drawingml/2006/picture">
+                <pic:pic xmlns:pic="http://schemas.openxmlformats.org/drawingml/2006/picture">
+                  <pic:nvPicPr>
+                    <pic:cNvPr id="0" name="" descr=""/>
+                    <pic:cNvPicPr>
+                      <a:picLocks noChangeAspect="1" noChangeArrowheads="1"/>
+                    </pic:cNvPicPr>
+                  </pic:nvPicPr>
+                  <pic:blipFill>
+                    <a:blip r:embed="rId21" cstate="none"/>
+                    <a:srcRect/>
+                    <a:stretch>
+                      <a:fillRect/>
+                    </a:stretch>
+                  </pic:blipFill>
+                  <pic:spPr bwMode="auto">
+                    <a:xfrm>
+                      <a:off x="0" y="0"/>
+                      <a:ext cx="3238500" cy="3238500"/>
+                    </a:xfrm>
+                    <a:prstGeom prst="rect">
+                      <a:avLst/>
+                    </a:prstGeom>
+                  </pic:spPr>
+                </pic:pic>
+              </a:graphicData>
+            </a:graphic>
+          </wp:inline>
+        </w:drawing>
+      </w:r>
+    </w:p>
+    <w:p>
+      <w:pPr>
+        <w:spacing w:after="220"/>
+        <w:jc w:val="center"/>
+      </w:pPr>
+      <w:r>
+        <w:rPr>
+          <w:rFonts w:ascii="Tahoma" w:cs="Tahoma" w:eastAsia="Tahoma" w:hAnsi="Tahoma"/>
+          <w:i/>
+          <w:iCs/>
+          <w:sz w:val="24"/>
+          <w:szCs w:val="24"/>
+        </w:rPr>
+        <w:t xml:space="preserve">Figure 13: Label text changed after clicking Change Text</w:t>
+      </w:r>
+    </w:p>
+    <w:p>
+      <w:pPr>
+        <w:keepNext/>
+        <w:spacing w:after="60" w:before="120"/>
+        <w:jc w:val="center"/>
+      </w:pPr>
+      <w:r>
+        <w:drawing>
+          <wp:inline distT="0" distB="0" distL="0" distR="0">
+            <wp:extent cx="3238500" cy="3238500"/>
+            <wp:effectExtent t="0" r="0" b="0" l="0"/>
+            <wp:docPr id="1" name="04-forest-background.png" descr="Figure 14: Panel background changed to Forest green" title="Figure 14: Panel background changed to Forest green"/>
+            <wp:cNvGraphicFramePr>
+              <a:graphicFrameLocks xmlns:a="http://schemas.openxmlformats.org/drawingml/2006/main" noChangeAspect="1"/>
+            </wp:cNvGraphicFramePr>
+            <a:graphic xmlns:a="http://schemas.openxmlformats.org/drawingml/2006/main">
+              <a:graphicData uri="http://schemas.openxmlformats.org/drawingml/2006/picture">
+                <pic:pic xmlns:pic="http://schemas.openxmlformats.org/drawingml/2006/picture">
+                  <pic:nvPicPr>
+                    <pic:cNvPr id="0" name="" descr=""/>
+                    <pic:cNvPicPr>
+                      <a:picLocks noChangeAspect="1" noChangeArrowheads="1"/>
+                    </pic:cNvPicPr>
+                  </pic:nvPicPr>
+                  <pic:blipFill>
+                    <a:blip r:embed="rId22" cstate="none"/>
+                    <a:srcRect/>
+                    <a:stretch>
+                      <a:fillRect/>
+                    </a:stretch>
+                  </pic:blipFill>
+                  <pic:spPr bwMode="auto">
+                    <a:xfrm>
+                      <a:off x="0" y="0"/>
+                      <a:ext cx="3238500" cy="3238500"/>
+                    </a:xfrm>
+                    <a:prstGeom prst="rect">
+                      <a:avLst/>
+                    </a:prstGeom>
+                  </pic:spPr>
+                </pic:pic>
+              </a:graphicData>
+            </a:graphic>
+          </wp:inline>
+        </w:drawing>
+      </w:r>
+    </w:p>
+    <w:p>
+      <w:pPr>
+        <w:spacing w:after="220"/>
+        <w:jc w:val="center"/>
+      </w:pPr>
+      <w:r>
+        <w:rPr>
+          <w:rFonts w:ascii="Tahoma" w:cs="Tahoma" w:eastAsia="Tahoma" w:hAnsi="Tahoma"/>
+          <w:i/>
+          <w:iCs/>
+          <w:sz w:val="24"/>
+          <w:szCs w:val="24"/>
+        </w:rPr>
+        <w:t xml:space="preserve">Figure 14: Panel background changed to Forest green</w:t>
+      </w:r>
+    </w:p>
+    <w:p>
+      <w:pPr>
+        <w:keepNext/>
+        <w:spacing w:after="60" w:before="120"/>
+        <w:jc w:val="center"/>
+      </w:pPr>
+      <w:r>
+        <w:drawing>
+          <wp:inline distT="0" distB="0" distL="0" distR="0">
+            <wp:extent cx="3238500" cy="3238500"/>
+            <wp:effectExtent t="0" r="0" b="0" l="0"/>
+            <wp:docPr id="1" name="05-light-background.png" descr="Figure 15: Light background, with text colours switching to dark so they stay readable" title="Figure 15: Light background, with text colours switching to dark so they stay readable"/>
+            <wp:cNvGraphicFramePr>
+              <a:graphicFrameLocks xmlns:a="http://schemas.openxmlformats.org/drawingml/2006/main" noChangeAspect="1"/>
+            </wp:cNvGraphicFramePr>
+            <a:graphic xmlns:a="http://schemas.openxmlformats.org/drawingml/2006/main">
+              <a:graphicData uri="http://schemas.openxmlformats.org/drawingml/2006/picture">
+                <pic:pic xmlns:pic="http://schemas.openxmlformats.org/drawingml/2006/picture">
+                  <pic:nvPicPr>
+                    <pic:cNvPr id="0" name="" descr=""/>
+                    <pic:cNvPicPr>
+                      <a:picLocks noChangeAspect="1" noChangeArrowheads="1"/>
+                    </pic:cNvPicPr>
+                  </pic:nvPicPr>
+                  <pic:blipFill>
+                    <a:blip r:embed="rId23" cstate="none"/>
+                    <a:srcRect/>
+                    <a:stretch>
+                      <a:fillRect/>
+                    </a:stretch>
+                  </pic:blipFill>
+                  <pic:spPr bwMode="auto">
+                    <a:xfrm>
+                      <a:off x="0" y="0"/>
+                      <a:ext cx="3238500" cy="3238500"/>
+                    </a:xfrm>
+                    <a:prstGeom prst="rect">
+                      <a:avLst/>
+                    </a:prstGeom>
+                  </pic:spPr>
+                </pic:pic>
+              </a:graphicData>
+            </a:graphic>
+          </wp:inline>
+        </w:drawing>
+      </w:r>
+    </w:p>
+    <w:p>
+      <w:pPr>
+        <w:spacing w:after="220"/>
+        <w:jc w:val="center"/>
+      </w:pPr>
+      <w:r>
+        <w:rPr>
+          <w:rFonts w:ascii="Tahoma" w:cs="Tahoma" w:eastAsia="Tahoma" w:hAnsi="Tahoma"/>
+          <w:i/>
+          <w:iCs/>
+          <w:sz w:val="24"/>
+          <w:szCs w:val="24"/>
+        </w:rPr>
+        <w:t xml:space="preserve">Figure 15: Light background, with text colours switching to dark so they stay readable</w:t>
+      </w:r>
+    </w:p>
+    <w:p>
+      <w:r>
+        <w:br w:type="page"/>
+      </w:r>
+    </w:p>
+    <w:p>
+      <w:pPr>
+        <w:pStyle w:val="Heading1"/>
+      </w:pPr>
+      <w:r>
         <w:t xml:space="preserve">6. Conclusion</w:t>
       </w:r>
     </w:p>
     <w:p>
       <w:pPr>
-        <w:spacing w:after="120" w:line="276"/>
+        <w:spacing w:after="140" w:line="276"/>
         <w:jc w:val="both"/>
       </w:pPr>
       <w:r>
@@ -1921,12 +2396,12 @@
           <w:sz w:val="24"/>
           <w:szCs w:val="24"/>
         </w:rPr>
-        <w:t xml:space="preserve">This assignment produced a basic interactive GUI application in Java Swing that meets all the requirements of the assignment brief. The application uses a JFrame as the main window, a JPanel to hold the components and a JLabel to display the welcome message together with an image. An ImageIcon provides both the custom application icon and the image on the label.</w:t>
-      </w:r>
-    </w:p>
-    <w:p>
-      <w:pPr>
-        <w:spacing w:after="120" w:line="276"/>
+        <w:t xml:space="preserve">This assignment produced an interactive GUI application in Java Swing that meets all the requirements of the assignment brief. The application uses a JFrame as the main window, a JPanel named panel to hold the components and a JLabel named label to display the welcome message together with the application logo. An ImageIcon provides both the custom window icon and the image on the label.</w:t>
+      </w:r>
+    </w:p>
+    <w:p>
+      <w:pPr>
+        <w:spacing w:after="140" w:line="276"/>
         <w:jc w:val="both"/>
       </w:pPr>
       <w:r>
@@ -1935,12 +2410,12 @@
           <w:sz w:val="24"/>
           <w:szCs w:val="24"/>
         </w:rPr>
-        <w:t xml:space="preserve">Inheritance was applied by creating the parent class BaseWindow and the child class SwingAssignment, and constructors were used to set up the window and its components, with super() linking the two. The additional buttons demonstrate event-driven programming, as the program responds to user actions by changing the label text and the panel background.</w:t>
-      </w:r>
-    </w:p>
-    <w:p>
-      <w:pPr>
-        <w:spacing w:after="120" w:line="276"/>
+        <w:t xml:space="preserve">Inheritance was applied by creating the parent class BaseWindow and the child class SwingAssignment, linked by super(), and by extending JPanel and JButton to create RoundedPanel, RoundedButton and ColourSwatch. Constructors were used to set up the window and every custom component. The buttons, text field and colour circles demonstrate event-driven programming, as the program responds to user actions by changing the label text and the panel background, and adjusts the text colours automatically so they remain readable.</w:t>
+      </w:r>
+    </w:p>
+    <w:p>
+      <w:pPr>
+        <w:spacing w:after="140" w:line="276"/>
         <w:jc w:val="both"/>
       </w:pPr>
       <w:r>
@@ -1949,7 +2424,7 @@
           <w:sz w:val="24"/>
           <w:szCs w:val="24"/>
         </w:rPr>
-        <w:t xml:space="preserve">Through this assignment, I gained practical experience in planning an interface with a wireframe, building a GUI with Swing components, applying object-oriented principles and handling user events. I also practised using Git and GitHub to manage and submit source code. In future, the application could be extended with menus, more input validation and saving user preferences.</w:t>
+        <w:t xml:space="preserve">Through this assignment, I gained practical experience in planning an interface with a wireframe, building and styling a GUI with Swing components, applying object-oriented principles and handling user events. I also practised using Git and GitHub to manage and submit source code.</w:t>
       </w:r>
     </w:p>
     <w:p>
@@ -1964,37 +2439,37 @@
       <w:pPr>
         <w:spacing w:after="120" w:line="276"/>
         <w:ind w:left="567" w:hanging="567"/>
-        <w:jc w:val="both"/>
-      </w:pPr>
-      <w:r>
-        <w:rPr>
-          <w:rFonts w:ascii="Tahoma" w:cs="Tahoma" w:eastAsia="Tahoma" w:hAnsi="Tahoma"/>
-          <w:sz w:val="24"/>
-          <w:szCs w:val="24"/>
-        </w:rPr>
-        <w:t xml:space="preserve">Figma (2026) Figma Help Center. Available at: https://help.figma.com (Accessed: 10 October 2026).</w:t>
+        <w:jc w:val="left"/>
+      </w:pPr>
+      <w:r>
+        <w:rPr>
+          <w:rFonts w:ascii="Tahoma" w:cs="Tahoma" w:eastAsia="Tahoma" w:hAnsi="Tahoma"/>
+          <w:sz w:val="24"/>
+          <w:szCs w:val="24"/>
+        </w:rPr>
+        <w:t xml:space="preserve">Figma (2026) Figma Help Center. Available at: https://help.figma.com (Accessed: 14 October 2026).</w:t>
       </w:r>
     </w:p>
     <w:p>
       <w:pPr>
         <w:spacing w:after="120" w:line="276"/>
         <w:ind w:left="567" w:hanging="567"/>
-        <w:jc w:val="both"/>
-      </w:pPr>
-      <w:r>
-        <w:rPr>
-          <w:rFonts w:ascii="Tahoma" w:cs="Tahoma" w:eastAsia="Tahoma" w:hAnsi="Tahoma"/>
-          <w:sz w:val="24"/>
-          <w:szCs w:val="24"/>
-        </w:rPr>
-        <w:t xml:space="preserve">GitHub (2026) GitHub Docs: Inviting collaborators to a personal repository. Available at: https://docs.github.com (Accessed: 10 October 2026).</w:t>
+        <w:jc w:val="left"/>
+      </w:pPr>
+      <w:r>
+        <w:rPr>
+          <w:rFonts w:ascii="Tahoma" w:cs="Tahoma" w:eastAsia="Tahoma" w:hAnsi="Tahoma"/>
+          <w:sz w:val="24"/>
+          <w:szCs w:val="24"/>
+        </w:rPr>
+        <w:t xml:space="preserve">GitHub (2026) GitHub Docs: Inviting collaborators to a personal repository. Available at: https://docs.github.com (Accessed: 14 October 2026).</w:t>
       </w:r>
     </w:p>
     <w:p>
       <w:pPr>
         <w:spacing w:after="120" w:line="276"/>
         <w:ind w:left="567" w:hanging="567"/>
-        <w:jc w:val="both"/>
+        <w:jc w:val="left"/>
       </w:pPr>
       <w:r>
         <w:rPr>
@@ -2009,60 +2484,75 @@
       <w:pPr>
         <w:spacing w:after="120" w:line="276"/>
         <w:ind w:left="567" w:hanging="567"/>
-        <w:jc w:val="both"/>
-      </w:pPr>
-      <w:r>
-        <w:rPr>
-          <w:rFonts w:ascii="Tahoma" w:cs="Tahoma" w:eastAsia="Tahoma" w:hAnsi="Tahoma"/>
-          <w:sz w:val="24"/>
-          <w:szCs w:val="24"/>
-        </w:rPr>
-        <w:t xml:space="preserve">Oracle (2024) Java Platform, Standard Edition API Specification: javax.swing. Available at: https://docs.oracle.com/en/java/javase/21/docs/api/java.desktop/javax/swing/package-summary.html (Accessed: 10 October 2026).</w:t>
+        <w:jc w:val="left"/>
+      </w:pPr>
+      <w:r>
+        <w:rPr>
+          <w:rFonts w:ascii="Tahoma" w:cs="Tahoma" w:eastAsia="Tahoma" w:hAnsi="Tahoma"/>
+          <w:sz w:val="24"/>
+          <w:szCs w:val="24"/>
+        </w:rPr>
+        <w:t xml:space="preserve">Oracle (2024) Java Platform, Standard Edition API Specification: javax.swing. Available at: https://docs.oracle.com/en/java/javase/21/docs/api/java.desktop/javax/swing/package-summary.html (Accessed: 14 October 2026).</w:t>
       </w:r>
     </w:p>
     <w:p>
       <w:pPr>
         <w:spacing w:after="120" w:line="276"/>
         <w:ind w:left="567" w:hanging="567"/>
-        <w:jc w:val="both"/>
-      </w:pPr>
-      <w:r>
-        <w:rPr>
-          <w:rFonts w:ascii="Tahoma" w:cs="Tahoma" w:eastAsia="Tahoma" w:hAnsi="Tahoma"/>
-          <w:sz w:val="24"/>
-          <w:szCs w:val="24"/>
-        </w:rPr>
-        <w:t xml:space="preserve">Oracle (2024) The Java Tutorials: Creating a GUI With Swing. Available at: https://docs.oracle.com/javase/tutorial/uiswing/ (Accessed: 10 October 2026).</w:t>
+        <w:jc w:val="left"/>
+      </w:pPr>
+      <w:r>
+        <w:rPr>
+          <w:rFonts w:ascii="Tahoma" w:cs="Tahoma" w:eastAsia="Tahoma" w:hAnsi="Tahoma"/>
+          <w:sz w:val="24"/>
+          <w:szCs w:val="24"/>
+        </w:rPr>
+        <w:t xml:space="preserve">Oracle (2024) The Java Tutorials: Creating a GUI With Swing. Available at: https://docs.oracle.com/javase/tutorial/uiswing/ (Accessed: 14 October 2026).</w:t>
       </w:r>
     </w:p>
     <w:p>
       <w:pPr>
         <w:spacing w:after="120" w:line="276"/>
         <w:ind w:left="567" w:hanging="567"/>
-        <w:jc w:val="both"/>
-      </w:pPr>
-      <w:r>
-        <w:rPr>
-          <w:rFonts w:ascii="Tahoma" w:cs="Tahoma" w:eastAsia="Tahoma" w:hAnsi="Tahoma"/>
-          <w:sz w:val="24"/>
-          <w:szCs w:val="24"/>
-        </w:rPr>
-        <w:t xml:space="preserve">Oracle (2024) The Java Tutorials: How to Write an Action Listener. Available at: https://docs.oracle.com/javase/tutorial/uiswing/events/actionlistener.html (Accessed: 10 October 2026).</w:t>
+        <w:jc w:val="left"/>
+      </w:pPr>
+      <w:r>
+        <w:rPr>
+          <w:rFonts w:ascii="Tahoma" w:cs="Tahoma" w:eastAsia="Tahoma" w:hAnsi="Tahoma"/>
+          <w:sz w:val="24"/>
+          <w:szCs w:val="24"/>
+        </w:rPr>
+        <w:t xml:space="preserve">Oracle (2024) The Java Tutorials: How to Write an Action Listener. Available at: https://docs.oracle.com/javase/tutorial/uiswing/events/actionlistener.html (Accessed: 14 October 2026).</w:t>
       </w:r>
     </w:p>
     <w:p>
       <w:pPr>
         <w:spacing w:after="120" w:line="276"/>
         <w:ind w:left="567" w:hanging="567"/>
-        <w:jc w:val="both"/>
-      </w:pPr>
-      <w:r>
-        <w:rPr>
-          <w:rFonts w:ascii="Tahoma" w:cs="Tahoma" w:eastAsia="Tahoma" w:hAnsi="Tahoma"/>
-          <w:sz w:val="24"/>
-          <w:szCs w:val="24"/>
-        </w:rPr>
-        <w:t xml:space="preserve">Oracle (2024) The Java Tutorials: Inheritance. Available at: https://docs.oracle.com/javase/tutorial/java/IandI/subclasses.html (Accessed: 10 October 2026).</w:t>
+        <w:jc w:val="left"/>
+      </w:pPr>
+      <w:r>
+        <w:rPr>
+          <w:rFonts w:ascii="Tahoma" w:cs="Tahoma" w:eastAsia="Tahoma" w:hAnsi="Tahoma"/>
+          <w:sz w:val="24"/>
+          <w:szCs w:val="24"/>
+        </w:rPr>
+        <w:t xml:space="preserve">Oracle (2024) The Java Tutorials: Performing Custom Painting. Available at: https://docs.oracle.com/javase/tutorial/uiswing/painting/ (Accessed: 14 October 2026).</w:t>
+      </w:r>
+    </w:p>
+    <w:p>
+      <w:pPr>
+        <w:spacing w:after="120" w:line="276"/>
+        <w:ind w:left="567" w:hanging="567"/>
+        <w:jc w:val="left"/>
+      </w:pPr>
+      <w:r>
+        <w:rPr>
+          <w:rFonts w:ascii="Tahoma" w:cs="Tahoma" w:eastAsia="Tahoma" w:hAnsi="Tahoma"/>
+          <w:sz w:val="24"/>
+          <w:szCs w:val="24"/>
+        </w:rPr>
+        <w:t xml:space="preserve">Oracle (2024) The Java Tutorials: Inheritance. Available at: https://docs.oracle.com/javase/tutorial/java/IandI/subclasses.html (Accessed: 14 October 2026).</w:t>
       </w:r>
     </w:p>
     <w:sectPr>
@@ -2127,8 +2617,8 @@
       <w:rPr>
         <w:rFonts w:ascii="Tahoma" w:cs="Tahoma" w:eastAsia="Tahoma" w:hAnsi="Tahoma"/>
         <w:color w:val="666666"/>
-        <w:sz w:val="16"/>
-        <w:szCs w:val="16"/>
+        <w:sz w:val="18"/>
+        <w:szCs w:val="18"/>
       </w:rPr>
       <w:t xml:space="preserve">PROG209 Event Driven Programming  |  Page </w:t>
     </w:r>
@@ -2136,8 +2626,8 @@
       <w:rPr>
         <w:rFonts w:ascii="Tahoma" w:cs="Tahoma" w:eastAsia="Tahoma" w:hAnsi="Tahoma"/>
         <w:color w:val="666666"/>
-        <w:sz w:val="16"/>
-        <w:szCs w:val="16"/>
+        <w:sz w:val="18"/>
+        <w:szCs w:val="18"/>
       </w:rPr>
       <w:fldChar w:fldCharType="begin"/>
       <w:instrText xml:space="preserve">PAGE</w:instrText>
@@ -2277,18 +2767,6 @@
       <w:start w:val="1"/>
       <w:numFmt w:val="bullet"/>
       <w:lvlText w:val="•"/>
-      <w:lvlJc w:val="left"/>
-      <w:pPr>
-        <w:ind w:left="567" w:hanging="283"/>
-      </w:pPr>
-    </w:lvl>
-  </w:abstractNum>
-  <w:abstractNum w:abstractNumId="3" w15:restartNumberingAfterBreak="0">
-    <w:multiLevelType w:val="hybridMultilevel"/>
-    <w:lvl w:ilvl="0" w15:tentative="1">
-      <w:start w:val="1"/>
-      <w:numFmt w:val="decimal"/>
-      <w:lvlText w:val="%1."/>
       <w:lvlJc w:val="left"/>
       <w:pPr>
         <w:ind w:left="567" w:hanging="283"/>
@@ -2500,14 +2978,14 @@
     <w:qFormat/>
     <w:pPr>
       <w:keepNext/>
-      <w:spacing w:after="140" w:before="300" w:line="276"/>
+      <w:spacing w:after="160" w:before="300" w:line="276"/>
       <w:outlineLvl w:val="0"/>
     </w:pPr>
     <w:rPr>
       <w:rFonts w:ascii="Tahoma" w:cs="Tahoma" w:eastAsia="Tahoma" w:hAnsi="Tahoma"/>
       <w:b/>
       <w:bCs/>
-      <w:color w:val="1A52A0"/>
+      <w:color w:val="3B3FB5"/>
       <w:sz w:val="30"/>
       <w:szCs w:val="30"/>
     </w:rPr>
@@ -2519,7 +2997,7 @@
     <w:qFormat/>
     <w:pPr>
       <w:keepNext/>
-      <w:spacing w:after="100" w:before="200" w:line="276"/>
+      <w:spacing w:after="120" w:before="200" w:line="276"/>
       <w:outlineLvl w:val="1"/>
     </w:pPr>
     <w:rPr>

</xml_diff>